<commit_message>
Cosmosofía I: versión reducida a la mitad y proyecto para Overleaf
Guion recortado a unos 9 minutos de locución. Se elimina la entrada
del programa (es la última sección) y se cierra con «per aspera ad
astra». Nueva fuente LaTeX (main.tex) con el mismo diseño, ZIP listo
para subir a Overleaf, y PDF y .docx regenerados desde ella.

Co-Authored-By: Claude Opus 5.5 <noreply@anthropic.com>
Claude-Session: https://claude.ai/code/session_01EXqttE8pyXoNGqAEVvoPvV
</commit_message>
<xml_diff>
--- a/COSMOSOFÍA EPISODIO I/COSMOSOFÍA EPISODIO I - Guion (editable).docx
+++ b/COSMOSOFÍA EPISODIO I/COSMOSOFÍA EPISODIO I - Guion (editable).docx
@@ -9,12 +9,11 @@
       </w:pPr>
       <w:r>
         <w:rPr>
-          <w:b w:val="0"/>
           <w:i w:val="0"/>
           <w:color w:val="6B7480"/>
           <w:sz w:val="18"/>
         </w:rPr>
-        <w:t>RADIOACCIÓN CÓSMICA · ASOCIACIÓN SUPERNOVA</w:t>
+        <w:t>ASOCIACIÓN ASTRONÓMICA SUPERNOVA</w:t>
       </w:r>
     </w:p>
     <w:p>
@@ -25,7 +24,6 @@
       <w:r>
         <w:rPr>
           <w:b/>
-          <w:i w:val="0"/>
           <w:color w:val="1B2F4E"/>
           <w:sz w:val="60"/>
         </w:rPr>
@@ -39,7 +37,6 @@
       </w:pPr>
       <w:r>
         <w:rPr>
-          <w:b w:val="0"/>
           <w:i/>
           <w:color w:val="1B2F4E"/>
           <w:sz w:val="28"/>
@@ -54,7 +51,6 @@
       </w:pPr>
       <w:r>
         <w:rPr>
-          <w:b w:val="0"/>
           <w:i w:val="0"/>
           <w:color w:val="6B7480"/>
           <w:sz w:val="22"/>
@@ -69,7 +65,6 @@
       <w:r>
         <w:rPr>
           <w:b/>
-          <w:i w:val="0"/>
           <w:color w:val="1B2F4E"/>
           <w:sz w:val="26"/>
         </w:rPr>
@@ -82,7 +77,6 @@
       </w:pPr>
       <w:r>
         <w:rPr>
-          <w:b w:val="0"/>
           <w:i/>
           <w:color w:val="6B7480"/>
           <w:sz w:val="21"/>
@@ -96,17 +90,16 @@
       </w:pPr>
       <w:r>
         <w:rPr>
-          <w:b w:val="0"/>
           <w:i w:val="0"/>
           <w:color w:val="6B7480"/>
           <w:sz w:val="19"/>
         </w:rPr>
-        <w:t>[SINTONÍA DE RADIOACCIÓN CÓSMICA]</w:t>
+        <w:t>[CORTINILLA DE LA SECCIÓN]</w:t>
       </w:r>
     </w:p>
     <w:p>
       <w:pPr>
-        <w:spacing w:after="120"/>
+        <w:spacing w:after="120" w:before="0"/>
       </w:pPr>
       <w:r>
         <w:rPr>
@@ -116,12 +109,27 @@
         <w:t xml:space="preserve">L1: </w:t>
       </w:r>
       <w:r>
-        <w:t>Hola y bienvenido todo el mundo a un nuevo episodio de RadioAcción Cósmica, la sección de Eureka dedicada a la astronomía, aquí en Radio Universidad de Salamanca, FM 89.0.</w:t>
+        <w:rPr>
+          <w:i w:val="0"/>
+        </w:rPr>
+        <w:t xml:space="preserve">Y para cerrar el programa, hoy estrenamos sección. La hemos llamado </w:t>
+      </w:r>
+      <w:r>
+        <w:rPr>
+          <w:i/>
+        </w:rPr>
+        <w:t>Cosmosofía</w:t>
+      </w:r>
+      <w:r>
+        <w:rPr>
+          <w:i w:val="0"/>
+        </w:rPr>
+        <w:t>.</w:t>
       </w:r>
     </w:p>
     <w:p>
       <w:pPr>
-        <w:spacing w:after="120"/>
+        <w:spacing w:after="120" w:before="0"/>
       </w:pPr>
       <w:r>
         <w:rPr>
@@ -131,12 +139,39 @@
         <w:t xml:space="preserve">L2: </w:t>
       </w:r>
       <w:r>
-        <w:t>Podéis oírnos la noche del jueves a las 22:00, el sábado a las 20:00 y el lunes a las 10:15 de la mañana.</w:t>
+        <w:rPr>
+          <w:i w:val="0"/>
+        </w:rPr>
+        <w:t xml:space="preserve">Del griego </w:t>
+      </w:r>
+      <w:r>
+        <w:rPr>
+          <w:i/>
+        </w:rPr>
+        <w:t>kósmos</w:t>
+      </w:r>
+      <w:r>
+        <w:rPr>
+          <w:i w:val="0"/>
+        </w:rPr>
+        <w:t xml:space="preserve">, que significa orden y también belleza, y </w:t>
+      </w:r>
+      <w:r>
+        <w:rPr>
+          <w:i/>
+        </w:rPr>
+        <w:t>sophía</w:t>
+      </w:r>
+      <w:r>
+        <w:rPr>
+          <w:i w:val="0"/>
+        </w:rPr>
+        <w:t>, sabiduría. La sabiduría que el cosmos nos devuelve cuando nos atrevemos a mirarlo de verdad.</w:t>
       </w:r>
     </w:p>
     <w:p>
       <w:pPr>
-        <w:spacing w:after="120"/>
+        <w:spacing w:after="120" w:before="0"/>
       </w:pPr>
       <w:r>
         <w:rPr>
@@ -146,97 +181,10 @@
         <w:t xml:space="preserve">L1: </w:t>
       </w:r>
       <w:r>
-        <w:t>Yo soy …</w:t>
-      </w:r>
-    </w:p>
-    <w:p>
-      <w:pPr>
-        <w:spacing w:after="120"/>
-      </w:pPr>
-      <w:r>
         <w:rPr>
-          <w:b/>
-          <w:color w:val="3A64A0"/>
+          <w:i w:val="0"/>
         </w:rPr>
-        <w:t xml:space="preserve">L2: </w:t>
-      </w:r>
-      <w:r>
-        <w:t>Y yo soy …</w:t>
-      </w:r>
-    </w:p>
-    <w:p>
-      <w:pPr>
-        <w:spacing w:after="120"/>
-      </w:pPr>
-      <w:r>
-        <w:rPr>
-          <w:b/>
-          <w:color w:val="3A64A0"/>
-        </w:rPr>
-        <w:t xml:space="preserve">L1: </w:t>
-      </w:r>
-      <w:r>
-        <w:t>Y hoy estrenamos algo nuevo. Una sección a la que hemos llamado Cosmosofía.</w:t>
-      </w:r>
-    </w:p>
-    <w:p>
-      <w:pPr>
-        <w:spacing w:after="120"/>
-      </w:pPr>
-      <w:r>
-        <w:rPr>
-          <w:b/>
-          <w:color w:val="3A64A0"/>
-        </w:rPr>
-        <w:t xml:space="preserve">L2: </w:t>
-      </w:r>
-      <w:r>
-        <w:t>Del griego kósmos, que significa orden, pero también belleza. Y sophía, sabiduría. La sabiduría del cosmos… o, mejor dicho, la sabiduría que el cosmos nos devuelve cuando nos atrevemos a mirarlo de verdad.</w:t>
-      </w:r>
-    </w:p>
-    <w:p>
-      <w:pPr>
-        <w:spacing w:after="120"/>
-      </w:pPr>
-      <w:r>
-        <w:rPr>
-          <w:b/>
-          <w:color w:val="3A64A0"/>
-        </w:rPr>
-        <w:t xml:space="preserve">L1: </w:t>
-      </w:r>
-      <w:r>
-        <w:t>Normalmente en este programa os contamos qué hay ahí arriba: misiones, lluvias de estrellas, fases de la Luna. En Cosmosofía queremos hacernos otra pregunta. No qué hay ahí arriba, sino qué significa todo eso para nosotros, aquí abajo.</w:t>
-      </w:r>
-    </w:p>
-    <w:p>
-      <w:pPr>
-        <w:spacing w:after="120"/>
-      </w:pPr>
-      <w:r>
-        <w:rPr>
-          <w:b/>
-          <w:color w:val="3A64A0"/>
-        </w:rPr>
-        <w:t xml:space="preserve">L2: </w:t>
-      </w:r>
-      <w:r>
-        <w:t>Porque la ciencia nos ha dado los datos más asombrosos que ha conocido la humanidad. Pero los datos, por sí solos, no te cambian la vida. Lo que te la cambia es lo que haces con ellos cuando apagas la luz y te quedas mirando al techo.</w:t>
-      </w:r>
-    </w:p>
-    <w:p>
-      <w:pPr>
-        <w:spacing w:after="120"/>
-      </w:pPr>
-      <w:r>
-        <w:rPr>
-          <w:b/>
-          <w:color w:val="3A64A0"/>
-        </w:rPr>
-        <w:t xml:space="preserve">L1: </w:t>
-      </w:r>
-      <w:r>
-        <w:t>Así que os proponemos algo. Si podéis, apagad alguna luz. Y acompañadnos.</w:t>
+        <w:t>Durante el programa os hemos contado qué hay ahí arriba. Ahora queremos preguntarnos qué significa todo eso para nosotros, aquí abajo. Así que, si podéis, apagad alguna luz y acompañadnos.</w:t>
       </w:r>
     </w:p>
     <w:p>
@@ -245,7 +193,6 @@
       </w:pPr>
       <w:r>
         <w:rPr>
-          <w:b w:val="0"/>
           <w:i w:val="0"/>
           <w:color w:val="6B7480"/>
           <w:sz w:val="19"/>
@@ -260,7 +207,6 @@
       <w:r>
         <w:rPr>
           <w:b/>
-          <w:i w:val="0"/>
           <w:color w:val="1B2F4E"/>
           <w:sz w:val="26"/>
         </w:rPr>
@@ -273,7 +219,6 @@
       </w:pPr>
       <w:r>
         <w:rPr>
-          <w:b w:val="0"/>
           <w:i/>
           <w:color w:val="6B7480"/>
           <w:sz w:val="21"/>
@@ -283,7 +228,25 @@
     </w:p>
     <w:p>
       <w:pPr>
-        <w:spacing w:after="120"/>
+        <w:spacing w:after="120" w:before="0"/>
+      </w:pPr>
+      <w:r>
+        <w:rPr>
+          <w:b/>
+          <w:color w:val="3A64A0"/>
+        </w:rPr>
+        <w:t xml:space="preserve">L1: </w:t>
+      </w:r>
+      <w:r>
+        <w:rPr>
+          <w:i w:val="0"/>
+        </w:rPr>
+        <w:t>Empecemos por situarnos. Estáis sobre un planeta que viaja alrededor del Sol a más de 100.000 kilómetros por hora. Ahora mismo, mientras escucháis.</w:t>
+      </w:r>
+    </w:p>
+    <w:p>
+      <w:pPr>
+        <w:spacing w:after="120" w:before="0"/>
       </w:pPr>
       <w:r>
         <w:rPr>
@@ -293,12 +256,15 @@
         <w:t xml:space="preserve">L2: </w:t>
       </w:r>
       <w:r>
-        <w:t>Empecemos por situarnos. Literalmente. ¿Dónde estáis ahora mismo?</w:t>
+        <w:rPr>
+          <w:i w:val="0"/>
+        </w:rPr>
+        <w:t>Y ese Sol es una estrella entre cientos de miles de millones en la Vía Láctea, que a su vez es una galaxia entre, quizá, billones. Y uno piensa: entonces no somos nada.</w:t>
       </w:r>
     </w:p>
     <w:p>
       <w:pPr>
-        <w:spacing w:after="120"/>
+        <w:spacing w:after="120" w:before="0"/>
       </w:pPr>
       <w:r>
         <w:rPr>
@@ -308,82 +274,10 @@
         <w:t xml:space="preserve">L1: </w:t>
       </w:r>
       <w:r>
-        <w:t>En Salamanca, en el coche, en la cocina, en la cama… Pero vamos a alejar el zoom.</w:t>
-      </w:r>
-    </w:p>
-    <w:p>
-      <w:pPr>
-        <w:spacing w:after="120"/>
-      </w:pPr>
-      <w:r>
         <w:rPr>
-          <w:b/>
-          <w:color w:val="3A64A0"/>
+          <w:i w:val="0"/>
         </w:rPr>
-        <w:t xml:space="preserve">L2: </w:t>
-      </w:r>
-      <w:r>
-        <w:t>Estáis sobre un planeta rocoso de unos 12.700 kilómetros de diámetro, que aquí, a nuestra latitud, os hace girar a unos 1.200 kilómetros por hora, y que a la vez viaja alrededor del Sol a más de 100.000 kilómetros por hora. Ahora mismo. Mientras escucháis.</w:t>
-      </w:r>
-    </w:p>
-    <w:p>
-      <w:pPr>
-        <w:spacing w:after="120"/>
-      </w:pPr>
-      <w:r>
-        <w:rPr>
-          <w:b/>
-          <w:color w:val="3A64A0"/>
-        </w:rPr>
-        <w:t xml:space="preserve">L1: </w:t>
-      </w:r>
-      <w:r>
-        <w:t>Y ese Sol es una estrella corriente, una entre cientos de miles de millones en una galaxia, la Vía Láctea. Y la Vía Láctea es solo una de los cientos de miles de millones de galaxias, quizá billones, que hay en el universo observable.</w:t>
-      </w:r>
-    </w:p>
-    <w:p>
-      <w:pPr>
-        <w:spacing w:after="120"/>
-      </w:pPr>
-      <w:r>
-        <w:rPr>
-          <w:b/>
-          <w:color w:val="3A64A0"/>
-        </w:rPr>
-        <w:t xml:space="preserve">L2: </w:t>
-      </w:r>
-      <w:r>
-        <w:t>Hay un físico británico, Brian Cox, que lo resume de una forma que a mí me pone la piel de gallina. Viene a decir: estamos en un planeta, entre cuatrocientos mil millones de estrellas, entre dos billones de galaxias en lo que alcanzamos a ver… y el universo podría ser infinito más allá de ese horizonte.</w:t>
-      </w:r>
-    </w:p>
-    <w:p>
-      <w:pPr>
-        <w:spacing w:after="120"/>
-      </w:pPr>
-      <w:r>
-        <w:rPr>
-          <w:b/>
-          <w:color w:val="3A64A0"/>
-        </w:rPr>
-        <w:t xml:space="preserve">L1: </w:t>
-      </w:r>
-      <w:r>
-        <w:t>Y uno, al oír eso, piensa: pues entonces no somos nada. Una mota de polvo. Un error de redondeo.</w:t>
-      </w:r>
-    </w:p>
-    <w:p>
-      <w:pPr>
-        <w:spacing w:after="120"/>
-      </w:pPr>
-      <w:r>
-        <w:rPr>
-          <w:b/>
-          <w:color w:val="3A64A0"/>
-        </w:rPr>
-        <w:t xml:space="preserve">L2: </w:t>
-      </w:r>
-      <w:r>
-        <w:t>Eso es lo que pensamos todos. Pero escuchad cómo sigue Cox, porque aquí le da la vuelta a todo.</w:t>
+        <w:t>El físico británico Brian Cox lo resume así: estamos en un planeta, entre cuatrocientos mil millones de estrellas, entre dos billones de galaxias… y el universo podría ser infinito más allá de nuestro horizonte. Pero luego le da la vuelta a todo.</w:t>
       </w:r>
     </w:p>
     <w:p>
@@ -394,7 +288,6 @@
       <w:r>
         <w:rPr>
           <w:b/>
-          <w:i w:val="0"/>
           <w:color w:val="3A64A0"/>
           <w:sz w:val="19"/>
         </w:rPr>
@@ -408,12 +301,11 @@
       </w:pPr>
       <w:r>
         <w:rPr>
-          <w:b w:val="0"/>
           <w:i/>
           <w:color w:val="1B2F4E"/>
           <w:sz w:val="22"/>
         </w:rPr>
-        <w:t>«Sin embargo, creo que podríamos ser importantes. Puede que solo haya una civilización en la Vía Láctea, entre cuatrocientos mil millones de soles. Y por eso, en realidad, en ese mar de cuatrocientos mil millones de soles, podríamos ser mucho más importantes y valiosos de lo que solemos reconocernos.»</w:t>
+        <w:t>«Sin embargo, creo que podríamos ser importantes. Puede que solo haya una civilización en la Vía Láctea. Y por eso, en ese mar de cuatrocientos mil millones de soles, podríamos ser mucho más importantes y valiosos de lo que solemos reconocernos.»</w:t>
       </w:r>
     </w:p>
     <w:p>
@@ -423,17 +315,34 @@
       </w:pPr>
       <w:r>
         <w:rPr>
-          <w:b w:val="0"/>
           <w:i w:val="0"/>
           <w:color w:val="6B7480"/>
           <w:sz w:val="18"/>
         </w:rPr>
-        <w:t>— Brian Cox, físico de partículas y divulgador · traducción adaptada</w:t>
+        <w:t>— Brian Cox · traducción adaptada</w:t>
       </w:r>
     </w:p>
     <w:p>
       <w:pPr>
-        <w:spacing w:after="120"/>
+        <w:spacing w:after="120" w:before="0"/>
+      </w:pPr>
+      <w:r>
+        <w:rPr>
+          <w:b/>
+          <w:color w:val="3A64A0"/>
+        </w:rPr>
+        <w:t xml:space="preserve">L2: </w:t>
+      </w:r>
+      <w:r>
+        <w:rPr>
+          <w:i w:val="0"/>
+        </w:rPr>
+        <w:t>La misma cifra que nos hacía sentir insignificantes es la que nos hace únicos. No hace falta ser grande para ser valioso. Basta con ser raro.</w:t>
+      </w:r>
+    </w:p>
+    <w:p>
+      <w:pPr>
+        <w:spacing w:after="120" w:before="0"/>
       </w:pPr>
       <w:r>
         <w:rPr>
@@ -443,67 +352,10 @@
         <w:t xml:space="preserve">L1: </w:t>
       </w:r>
       <w:r>
-        <w:t>Qué giro. La misma cifra que nos hacía sentir insignificantes… es la que nos hace únicos.</w:t>
-      </w:r>
-    </w:p>
-    <w:p>
-      <w:pPr>
-        <w:spacing w:after="120"/>
-      </w:pPr>
-      <w:r>
         <w:rPr>
-          <w:b/>
-          <w:color w:val="3A64A0"/>
+          <w:i w:val="0"/>
         </w:rPr>
-        <w:t xml:space="preserve">L2: </w:t>
-      </w:r>
-      <w:r>
-        <w:t>Si la vida inteligente es tan rara como empezamos a sospechar, cada uno de nosotros es algo escasísimo en el universo conocido. No hace falta ser grande para ser valioso. Basta con ser raro. Y nosotros, que sepamos, somos rarísimos.</w:t>
-      </w:r>
-    </w:p>
-    <w:p>
-      <w:pPr>
-        <w:spacing w:after="120"/>
-      </w:pPr>
-      <w:r>
-        <w:rPr>
-          <w:b/>
-          <w:color w:val="3A64A0"/>
-        </w:rPr>
-        <w:t xml:space="preserve">L1: </w:t>
-      </w:r>
-      <w:r>
-        <w:t>Hay otra imagen que lo cuenta muy bien. Carl Sagan, el gran divulgador del siglo XX, convenció a la NASA de que la sonda Voyager 1, cuando ya se alejaba del sistema solar, girase su cámara y mirase atrás. Fue el 14 de febrero de 1990.</w:t>
-      </w:r>
-    </w:p>
-    <w:p>
-      <w:pPr>
-        <w:spacing w:after="120"/>
-      </w:pPr>
-      <w:r>
-        <w:rPr>
-          <w:b/>
-          <w:color w:val="3A64A0"/>
-        </w:rPr>
-        <w:t xml:space="preserve">L2: </w:t>
-      </w:r>
-      <w:r>
-        <w:t>Desde unos seis mil millones de kilómetros, la Tierra aparecía como un píxel. Menos que un píxel, de hecho. Un puntito azul pálido suspendido en un rayo de luz del Sol.</w:t>
-      </w:r>
-    </w:p>
-    <w:p>
-      <w:pPr>
-        <w:spacing w:after="120"/>
-      </w:pPr>
-      <w:r>
-        <w:rPr>
-          <w:b/>
-          <w:color w:val="3A64A0"/>
-        </w:rPr>
-        <w:t xml:space="preserve">L1: </w:t>
-      </w:r>
-      <w:r>
-        <w:t>Y Sagan escribió sobre esa foto uno de los textos más bonitos que se han escrito nunca.</w:t>
+        <w:t>En 1990, Carl Sagan consiguió que la sonda Voyager 1 se girase y fotografiase la Tierra desde unos seis mil millones de kilómetros. Salió un puntito azul pálido, más pequeño que un píxel.</w:t>
       </w:r>
     </w:p>
     <w:p>
@@ -514,7 +366,6 @@
       <w:r>
         <w:rPr>
           <w:b/>
-          <w:i w:val="0"/>
           <w:color w:val="3A64A0"/>
           <w:sz w:val="19"/>
         </w:rPr>
@@ -528,12 +379,11 @@
       </w:pPr>
       <w:r>
         <w:rPr>
-          <w:b w:val="0"/>
           <w:i/>
           <w:color w:val="1B2F4E"/>
           <w:sz w:val="22"/>
         </w:rPr>
-        <w:t>«Mirad de nuevo ese punto. Eso es aquí. Eso es nuestro hogar. Eso somos nosotros. En él, todos los que amáis, todos los que conocéis, todos de los que alguna vez oísteis hablar, cada ser humano que ha existido, vivió su vida.»</w:t>
+        <w:t>«Mirad de nuevo ese punto. Eso es aquí. Eso es nuestro hogar. Eso somos nosotros. En él, todos los que amáis, todos los que conocéis, cada ser humano que ha existido, vivió su vida.»</w:t>
       </w:r>
     </w:p>
     <w:p>
@@ -543,17 +393,32 @@
       </w:pPr>
       <w:r>
         <w:rPr>
-          <w:b w:val="0"/>
           <w:i w:val="0"/>
           <w:color w:val="6B7480"/>
           <w:sz w:val="18"/>
         </w:rPr>
-        <w:t>— Carl Sagan, Un punto azul pálido (1994)</w:t>
+        <w:t xml:space="preserve">— Carl Sagan, </w:t>
+      </w:r>
+      <w:r>
+        <w:rPr>
+          <w:i/>
+          <w:color w:val="6B7480"/>
+          <w:sz w:val="18"/>
+        </w:rPr>
+        <w:t>Un punto azul pálido</w:t>
+      </w:r>
+      <w:r>
+        <w:rPr>
+          <w:i w:val="0"/>
+          <w:color w:val="6B7480"/>
+          <w:sz w:val="18"/>
+        </w:rPr>
+        <w:t xml:space="preserve"> (1994)</w:t>
       </w:r>
     </w:p>
     <w:p>
       <w:pPr>
-        <w:spacing w:after="120"/>
+        <w:spacing w:after="120" w:before="0"/>
       </w:pPr>
       <w:r>
         <w:rPr>
@@ -563,37 +428,10 @@
         <w:t xml:space="preserve">L2: </w:t>
       </w:r>
       <w:r>
-        <w:t>Y un dato precioso para este otoño. Esa misma Voyager 1 sigue viajando, casi cincuenta años después de su lanzamiento. Y hacia noviembre de este 2026 se convertirá en el primer objeto fabricado por el ser humano en alcanzar un día-luz de distancia. Su señal, viajando a la velocidad de la luz, tardará un día entero en llegarnos.</w:t>
-      </w:r>
-    </w:p>
-    <w:p>
-      <w:pPr>
-        <w:spacing w:after="120"/>
-      </w:pPr>
-      <w:r>
         <w:rPr>
-          <w:b/>
-          <w:color w:val="3A64A0"/>
+          <w:i w:val="0"/>
         </w:rPr>
-        <w:t xml:space="preserve">L1: </w:t>
-      </w:r>
-      <w:r>
-        <w:t>Un mensajero nuestro, a veinticuatro horas-luz de casa. Que todavía, en cierto modo, sigue mirando atrás.</w:t>
-      </w:r>
-    </w:p>
-    <w:p>
-      <w:pPr>
-        <w:spacing w:after="120"/>
-      </w:pPr>
-      <w:r>
-        <w:rPr>
-          <w:b/>
-          <w:color w:val="3A64A0"/>
-        </w:rPr>
-        <w:t xml:space="preserve">L2: </w:t>
-      </w:r>
-      <w:r>
-        <w:t>Y si os acordáis, en un programa anterior os hablábamos de Artemis II y de aquella foto de la Tierra tomada desde la nave Orion. Treinta y seis años después del punto azul pálido, seguimos haciendo lo mismo: irnos lejos… para poder vernos.</w:t>
+        <w:t>Y esa misma Voyager 1, hacia noviembre de este 2026, será el primer objeto humano en alcanzar un día-luz de distancia. Seguimos haciendo lo mismo: irnos lejos… para poder vernos.</w:t>
       </w:r>
     </w:p>
     <w:p>
@@ -603,7 +441,6 @@
       <w:r>
         <w:rPr>
           <w:b/>
-          <w:i w:val="0"/>
           <w:color w:val="1B2F4E"/>
           <w:sz w:val="26"/>
         </w:rPr>
@@ -616,7 +453,6 @@
       </w:pPr>
       <w:r>
         <w:rPr>
-          <w:b w:val="0"/>
           <w:i/>
           <w:color w:val="6B7480"/>
           <w:sz w:val="21"/>
@@ -626,7 +462,7 @@
     </w:p>
     <w:p>
       <w:pPr>
-        <w:spacing w:after="120"/>
+        <w:spacing w:after="120" w:before="0"/>
       </w:pPr>
       <w:r>
         <w:rPr>
@@ -636,12 +472,15 @@
         <w:t xml:space="preserve">L1: </w:t>
       </w:r>
       <w:r>
-        <w:t>Ya sabemos dónde estamos. Ahora la pregunta es otra: ¿qué somos?</w:t>
+        <w:rPr>
+          <w:i w:val="0"/>
+        </w:rPr>
+        <w:t>Ahora la pregunta es otra: ¿qué somos? El hidrógeno del agua de vuestro cuerpo nació poco después del Big Bang, hace unos 13.800 millones de años.</w:t>
       </w:r>
     </w:p>
     <w:p>
       <w:pPr>
-        <w:spacing w:after="120"/>
+        <w:spacing w:after="120" w:before="0"/>
       </w:pPr>
       <w:r>
         <w:rPr>
@@ -651,12 +490,15 @@
         <w:t xml:space="preserve">L2: </w:t>
       </w:r>
       <w:r>
-        <w:t>Y aquí la astrofísica nos regala una de las respuestas más poéticas que existen. Lo mejor es que no es una metáfora, es completamente literal.</w:t>
+        <w:rPr>
+          <w:i w:val="0"/>
+        </w:rPr>
+        <w:t>Y el carbono, el calcio de los huesos o el hierro de la sangre se forjaron dentro de estrellas que murieron, algunas como supernovas. Sin supernovas no estaríamos aquí para hablar de ellas.</w:t>
       </w:r>
     </w:p>
     <w:p>
       <w:pPr>
-        <w:spacing w:after="120"/>
+        <w:spacing w:after="120" w:before="0"/>
       </w:pPr>
       <w:r>
         <w:rPr>
@@ -666,12 +508,15 @@
         <w:t xml:space="preserve">L1: </w:t>
       </w:r>
       <w:r>
-        <w:t>El hidrógeno de vuestro cuerpo, el que forma parte del agua que lleváis dentro, nació poco después del Big Bang, hace unos 13.800 millones de años. Tenéis dentro átomos casi tan viejos como el propio tiempo.</w:t>
+        <w:rPr>
+          <w:i w:val="0"/>
+        </w:rPr>
+        <w:t>Que las estrellas están hechas sobre todo de hidrógeno y helio lo descubrió en 1925 una joven astrónoma, Cecilia Payne. La convencieron de presentarlo como algo que, casi con seguridad, no podía ser real… y pocos años después le dieron la razón.</w:t>
       </w:r>
     </w:p>
     <w:p>
       <w:pPr>
-        <w:spacing w:after="120"/>
+        <w:spacing w:after="120" w:before="0"/>
       </w:pPr>
       <w:r>
         <w:rPr>
@@ -681,37 +526,10 @@
         <w:t xml:space="preserve">L2: </w:t>
       </w:r>
       <w:r>
-        <w:t>Pero el carbono, el oxígeno, el calcio de los huesos o el hierro de la sangre no estaban al principio. Se cocinaron en el interior de las estrellas. Estrellas que nacieron, envejecieron y murieron, algunas explotando como supernovas, mucho antes de que existiera el Sol.</w:t>
-      </w:r>
-    </w:p>
-    <w:p>
-      <w:pPr>
-        <w:spacing w:after="120"/>
-      </w:pPr>
-      <w:r>
         <w:rPr>
-          <w:b/>
-          <w:color w:val="3A64A0"/>
+          <w:i w:val="0"/>
         </w:rPr>
-        <w:t xml:space="preserve">L1: </w:t>
-      </w:r>
-      <w:r>
-        <w:t>Qué nombre más apropiado para una asociación, ¿no? Supernova.</w:t>
-      </w:r>
-    </w:p>
-    <w:p>
-      <w:pPr>
-        <w:spacing w:after="120"/>
-      </w:pPr>
-      <w:r>
-        <w:rPr>
-          <w:b/>
-          <w:color w:val="3A64A0"/>
-        </w:rPr>
-        <w:t xml:space="preserve">L2: </w:t>
-      </w:r>
-      <w:r>
-        <w:t>Desde luego. Sin supernovas no estaríamos aquí para hablar de ellas.</w:t>
+        <w:t>Ella misma escribió una frase que deberíamos tener todos pegada en la mesa.</w:t>
       </w:r>
     </w:p>
     <w:p>
@@ -722,11 +540,10 @@
       <w:r>
         <w:rPr>
           <w:b/>
-          <w:i w:val="0"/>
           <w:color w:val="3A64A0"/>
           <w:sz w:val="19"/>
         </w:rPr>
-        <w:t>Eco 2.1 (Carl Sagan)</w:t>
+        <w:t>Eco 2.1 (Cecilia Payne)</w:t>
       </w:r>
     </w:p>
     <w:p>
@@ -736,12 +553,11 @@
       </w:pPr>
       <w:r>
         <w:rPr>
-          <w:b w:val="0"/>
           <w:i/>
           <w:color w:val="1B2F4E"/>
           <w:sz w:val="22"/>
         </w:rPr>
-        <w:t>«El nitrógeno de nuestro ADN, el calcio de nuestros dientes, el hierro de nuestra sangre, el carbono de nuestras tartas de manzana se formaron en el interior de estrellas que colapsaban. Estamos hechos de materia estelar.»</w:t>
+        <w:t>«La recompensa del joven científico es la emoción de ser la primera persona en la historia del mundo en ver algo o en comprenderlo.»</w:t>
       </w:r>
     </w:p>
     <w:p>
@@ -751,17 +567,31 @@
       </w:pPr>
       <w:r>
         <w:rPr>
-          <w:b w:val="0"/>
           <w:i w:val="0"/>
           <w:color w:val="6B7480"/>
           <w:sz w:val="18"/>
         </w:rPr>
-        <w:t>— Carl Sagan, Cosmos (1980)</w:t>
+        <w:t xml:space="preserve">— Cecilia Payne-Gaposchkin, </w:t>
+      </w:r>
+      <w:r>
+        <w:rPr>
+          <w:i/>
+          <w:color w:val="6B7480"/>
+          <w:sz w:val="18"/>
+        </w:rPr>
+        <w:t>autobiografía</w:t>
+      </w:r>
+      <w:r>
+        <w:rPr>
+          <w:i w:val="0"/>
+          <w:color w:val="6B7480"/>
+          <w:sz w:val="18"/>
+        </w:rPr>
       </w:r>
     </w:p>
     <w:p>
       <w:pPr>
-        <w:spacing w:after="120"/>
+        <w:spacing w:after="120" w:before="0"/>
       </w:pPr>
       <w:r>
         <w:rPr>
@@ -771,82 +601,10 @@
         <w:t xml:space="preserve">L1: </w:t>
       </w:r>
       <w:r>
-        <w:t>Y aquí queremos contar una historia que tiene mucho que ver con el espíritu de esta sección. La de Cecilia Payne.</w:t>
-      </w:r>
-    </w:p>
-    <w:p>
-      <w:pPr>
-        <w:spacing w:after="120"/>
-      </w:pPr>
-      <w:r>
         <w:rPr>
-          <w:b/>
-          <w:color w:val="3A64A0"/>
+          <w:i w:val="0"/>
         </w:rPr>
-        <w:t xml:space="preserve">L2: </w:t>
-      </w:r>
-      <w:r>
-        <w:t>Una joven astrónoma británica que en 1925, en su tesis doctoral en Harvard, descubrió de qué están hechas las estrellas: sobre todo de hidrógeno y helio.</w:t>
-      </w:r>
-    </w:p>
-    <w:p>
-      <w:pPr>
-        <w:spacing w:after="120"/>
-      </w:pPr>
-      <w:r>
-        <w:rPr>
-          <w:b/>
-          <w:color w:val="3A64A0"/>
-        </w:rPr>
-        <w:t xml:space="preserve">L1: </w:t>
-      </w:r>
-      <w:r>
-        <w:t>Hoy lo sabe cualquier estudiante. Pero entonces se pensaba que las estrellas tenían una composición parecida a la de la Tierra. Y uno de los astrónomos más influyentes de la época, Henry Norris Russell, la convenció de que presentara su resultado como algo que, casi con seguridad, no podía ser real.</w:t>
-      </w:r>
-    </w:p>
-    <w:p>
-      <w:pPr>
-        <w:spacing w:after="120"/>
-      </w:pPr>
-      <w:r>
-        <w:rPr>
-          <w:b/>
-          <w:color w:val="3A64A0"/>
-        </w:rPr>
-        <w:t xml:space="preserve">L2: </w:t>
-      </w:r>
-      <w:r>
-        <w:t>Pocos años después, el propio Russell llegó a la misma conclusión por otro camino. Y con el tiempo, aquella tesis llegó a ser considerada la más brillante jamás escrita en astronomía.</w:t>
-      </w:r>
-    </w:p>
-    <w:p>
-      <w:pPr>
-        <w:spacing w:after="120"/>
-      </w:pPr>
-      <w:r>
-        <w:rPr>
-          <w:b/>
-          <w:color w:val="3A64A0"/>
-        </w:rPr>
-        <w:t xml:space="preserve">L1: </w:t>
-      </w:r>
-      <w:r>
-        <w:t>Lo contamos porque la ciencia no es una colección de verdades grabadas en piedra. Es una conversación. A veces incómoda. Avanza cuando alguien se atreve a decir algo que nadie quería oír… y cuando los demás tienen la grandeza de escucharlo.</w:t>
-      </w:r>
-    </w:p>
-    <w:p>
-      <w:pPr>
-        <w:spacing w:after="120"/>
-      </w:pPr>
-      <w:r>
-        <w:rPr>
-          <w:b/>
-          <w:color w:val="3A64A0"/>
-        </w:rPr>
-        <w:t xml:space="preserve">L2: </w:t>
-      </w:r>
-      <w:r>
-        <w:t>Payne escribió una frase que deberíamos tener todos pegada en la mesa de trabajo.</w:t>
+        <w:t>Por eso la ciencia no es un muro de certezas, sino una conversación. Avanza cuando alguien se atreve a decir lo que nadie quiere oír, y los demás tienen la grandeza de escuchar.</w:t>
       </w:r>
     </w:p>
     <w:p>
@@ -857,11 +615,10 @@
       <w:r>
         <w:rPr>
           <w:b/>
-          <w:i w:val="0"/>
           <w:color w:val="3A64A0"/>
           <w:sz w:val="19"/>
         </w:rPr>
-        <w:t>Eco 2.2 (Cecilia Payne)</w:t>
+        <w:t>Eco 2.2 (Carl Sagan)</w:t>
       </w:r>
     </w:p>
     <w:p>
@@ -871,67 +628,6 @@
       </w:pPr>
       <w:r>
         <w:rPr>
-          <w:b w:val="0"/>
-          <w:i/>
-          <w:color w:val="1B2F4E"/>
-          <w:sz w:val="22"/>
-        </w:rPr>
-        <w:t>«La recompensa del joven científico es la emoción de ser la primera persona en la historia del mundo en ver algo o en comprenderlo. Nada se puede comparar con esa experiencia.»</w:t>
-      </w:r>
-    </w:p>
-    <w:p>
-      <w:pPr>
-        <w:spacing w:after="160" w:before="0"/>
-        <w:ind w:left="680"/>
-      </w:pPr>
-      <w:r>
-        <w:rPr>
-          <w:b w:val="0"/>
-          <w:i w:val="0"/>
-          <w:color w:val="6B7480"/>
-          <w:sz w:val="18"/>
-        </w:rPr>
-        <w:t>— Cecilia Payne-Gaposchkin, autobiografía</w:t>
-      </w:r>
-    </w:p>
-    <w:p>
-      <w:pPr>
-        <w:spacing w:after="120"/>
-      </w:pPr>
-      <w:r>
-        <w:rPr>
-          <w:b/>
-          <w:color w:val="3A64A0"/>
-        </w:rPr>
-        <w:t xml:space="preserve">L1: </w:t>
-      </w:r>
-      <w:r>
-        <w:t>Y Sagan tenía una forma de cerrar este círculo que nos parece insuperable.</w:t>
-      </w:r>
-    </w:p>
-    <w:p>
-      <w:pPr>
-        <w:spacing w:after="20" w:before="0"/>
-        <w:ind w:left="680"/>
-      </w:pPr>
-      <w:r>
-        <w:rPr>
-          <w:b/>
-          <w:i w:val="0"/>
-          <w:color w:val="3A64A0"/>
-          <w:sz w:val="19"/>
-        </w:rPr>
-        <w:t>Eco 2.3 (Carl Sagan)</w:t>
-      </w:r>
-    </w:p>
-    <w:p>
-      <w:pPr>
-        <w:spacing w:after="20" w:before="0"/>
-        <w:ind w:left="680"/>
-      </w:pPr>
-      <w:r>
-        <w:rPr>
-          <w:b w:val="0"/>
           <w:i/>
           <w:color w:val="1B2F4E"/>
           <w:sz w:val="22"/>
@@ -946,17 +642,32 @@
       </w:pPr>
       <w:r>
         <w:rPr>
-          <w:b w:val="0"/>
           <w:i w:val="0"/>
           <w:color w:val="6B7480"/>
           <w:sz w:val="18"/>
         </w:rPr>
-        <w:t>— Carl Sagan, Cosmos (1980)</w:t>
+        <w:t xml:space="preserve">— Carl Sagan, </w:t>
+      </w:r>
+      <w:r>
+        <w:rPr>
+          <w:i/>
+          <w:color w:val="6B7480"/>
+          <w:sz w:val="18"/>
+        </w:rPr>
+        <w:t>Cosmos</w:t>
+      </w:r>
+      <w:r>
+        <w:rPr>
+          <w:i w:val="0"/>
+          <w:color w:val="6B7480"/>
+          <w:sz w:val="18"/>
+        </w:rPr>
+        <w:t xml:space="preserve"> (1980)</w:t>
       </w:r>
     </w:p>
     <w:p>
       <w:pPr>
-        <w:spacing w:after="120"/>
+        <w:spacing w:after="120" w:before="0"/>
       </w:pPr>
       <w:r>
         <w:rPr>
@@ -966,37 +677,10 @@
         <w:t xml:space="preserve">L2: </w:t>
       </w:r>
       <w:r>
-        <w:t>Pensadlo un momento. Átomos forjados en estrellas que, durante miles de millones de años, se han ido organizando hasta formar un cerebro… capaz de mirar al cielo y preguntarse de dónde vienen esos mismos átomos.</w:t>
-      </w:r>
-    </w:p>
-    <w:p>
-      <w:pPr>
-        <w:spacing w:after="120"/>
-      </w:pPr>
-      <w:r>
         <w:rPr>
-          <w:b/>
-          <w:color w:val="3A64A0"/>
+          <w:i w:val="0"/>
         </w:rPr>
-        <w:t xml:space="preserve">L1: </w:t>
-      </w:r>
-      <w:r>
-        <w:t>Brian Cox lo dice a su manera: somos el cosmos hecho consciente. La vida es el medio por el que el universo se entiende a sí mismo.</w:t>
-      </w:r>
-    </w:p>
-    <w:p>
-      <w:pPr>
-        <w:spacing w:after="120"/>
-      </w:pPr>
-      <w:r>
-        <w:rPr>
-          <w:b/>
-          <w:color w:val="3A64A0"/>
-        </w:rPr>
-        <w:t xml:space="preserve">L2: </w:t>
-      </w:r>
-      <w:r>
-        <w:t>No estamos en el universo como quien está dentro de una habitación. Somos el universo, en una de sus formas más improbables y más bonitas.</w:t>
+        <w:t>Átomos forjados en estrellas que se han organizado hasta formar un cerebro capaz de preguntarse de dónde vienen. Cox lo dice así: somos el cosmos hecho consciente.</w:t>
       </w:r>
     </w:p>
     <w:p>
@@ -1006,7 +690,6 @@
       <w:r>
         <w:rPr>
           <w:b/>
-          <w:i w:val="0"/>
           <w:color w:val="1B2F4E"/>
           <w:sz w:val="26"/>
         </w:rPr>
@@ -1019,7 +702,6 @@
       </w:pPr>
       <w:r>
         <w:rPr>
-          <w:b w:val="0"/>
           <w:i/>
           <w:color w:val="6B7480"/>
           <w:sz w:val="21"/>
@@ -1029,7 +711,25 @@
     </w:p>
     <w:p>
       <w:pPr>
-        <w:spacing w:after="120"/>
+        <w:spacing w:after="120" w:before="0"/>
+      </w:pPr>
+      <w:r>
+        <w:rPr>
+          <w:b/>
+          <w:color w:val="3A64A0"/>
+        </w:rPr>
+        <w:t xml:space="preserve">L2: </w:t>
+      </w:r>
+      <w:r>
+        <w:rPr>
+          <w:i w:val="0"/>
+        </w:rPr>
+        <w:t>Vamos con una idea que parece triste: la segunda ley de la termodinámica. El desorden del universo siempre aumenta. El café se enfría, las estrellas se apagan.</w:t>
+      </w:r>
+    </w:p>
+    <w:p>
+      <w:pPr>
+        <w:spacing w:after="120" w:before="0"/>
       </w:pPr>
       <w:r>
         <w:rPr>
@@ -1039,97 +739,10 @@
         <w:t xml:space="preserve">L1: </w:t>
       </w:r>
       <w:r>
-        <w:t>Ahora vamos con una idea que al principio puede parecer triste. Pero quedaos hasta el final, porque probablemente sea la más esperanzadora de todo el programa.</w:t>
-      </w:r>
-    </w:p>
-    <w:p>
-      <w:pPr>
-        <w:spacing w:after="120"/>
-      </w:pPr>
-      <w:r>
         <w:rPr>
-          <w:b/>
-          <w:color w:val="3A64A0"/>
+          <w:i w:val="0"/>
         </w:rPr>
-        <w:t xml:space="preserve">L2: </w:t>
-      </w:r>
-      <w:r>
-        <w:t>La segunda ley de la termodinámica.</w:t>
-      </w:r>
-    </w:p>
-    <w:p>
-      <w:pPr>
-        <w:spacing w:after="120"/>
-      </w:pPr>
-      <w:r>
-        <w:rPr>
-          <w:b/>
-          <w:color w:val="3A64A0"/>
-        </w:rPr>
-        <w:t xml:space="preserve">L1: </w:t>
-      </w:r>
-      <w:r>
-        <w:t>Uy, me parece que alguien acaba de cambiar de emisora…</w:t>
-      </w:r>
-    </w:p>
-    <w:p>
-      <w:pPr>
-        <w:spacing w:after="120"/>
-      </w:pPr>
-      <w:r>
-        <w:rPr>
-          <w:b/>
-          <w:color w:val="3A64A0"/>
-        </w:rPr>
-        <w:t xml:space="preserve">L2: </w:t>
-      </w:r>
-      <w:r>
-        <w:t>(Riendo) No, no, aguantad, que merece la pena. La segunda ley dice, en esencia, que el desorden del universo, lo que los físicos llaman entropía, siempre tiende a aumentar. El café se enfría, los castillos de arena se deshacen y las estrellas consumen su combustible.</w:t>
-      </w:r>
-    </w:p>
-    <w:p>
-      <w:pPr>
-        <w:spacing w:after="120"/>
-      </w:pPr>
-      <w:r>
-        <w:rPr>
-          <w:b/>
-          <w:color w:val="3A64A0"/>
-        </w:rPr>
-        <w:t xml:space="preserve">L1: </w:t>
-      </w:r>
-      <w:r>
-        <w:t>Es la flecha del tiempo. La razón por la que recordamos el pasado y no el futuro. La razón por la que un vaso roto nunca se recompone solo.</w:t>
-      </w:r>
-    </w:p>
-    <w:p>
-      <w:pPr>
-        <w:spacing w:after="120"/>
-      </w:pPr>
-      <w:r>
-        <w:rPr>
-          <w:b/>
-          <w:color w:val="3A64A0"/>
-        </w:rPr>
-        <w:t xml:space="preserve">L2: </w:t>
-      </w:r>
-      <w:r>
-        <w:t>Y a largo plazo, muy a largo plazo, las estrellas se apagarán. Nuestro Sol tiene combustible para unos cinco mil millones de años más. Y dentro de muchísimo más tiempo, el universo dejará de fabricar estrellas nuevas.</w:t>
-      </w:r>
-    </w:p>
-    <w:p>
-      <w:pPr>
-        <w:spacing w:after="120"/>
-      </w:pPr>
-      <w:r>
-        <w:rPr>
-          <w:b/>
-          <w:color w:val="3A64A0"/>
-        </w:rPr>
-        <w:t xml:space="preserve">L1: </w:t>
-      </w:r>
-      <w:r>
-        <w:t>Hasta aquí, la parte fría. Pero ahora viene lo que nos parece maravilloso. Y es Brian Cox quien mejor lo explica.</w:t>
+        <w:t>Es la flecha del tiempo: la razón por la que recordamos el pasado y no el futuro, y por la que un vaso roto nunca se recompone solo. Pero escuchad cómo lo ve Cox.</w:t>
       </w:r>
     </w:p>
     <w:p>
@@ -1140,7 +753,6 @@
       <w:r>
         <w:rPr>
           <w:b/>
-          <w:i w:val="0"/>
           <w:color w:val="3A64A0"/>
           <w:sz w:val="19"/>
         </w:rPr>
@@ -1154,12 +766,11 @@
       </w:pPr>
       <w:r>
         <w:rPr>
-          <w:b w:val="0"/>
           <w:i/>
           <w:color w:val="1B2F4E"/>
           <w:sz w:val="22"/>
         </w:rPr>
-        <w:t>«El universo tiende hacia un estado cada vez más desordenado. Y en ese proceso de ir del orden al desorden, la complejidad surge de forma natural, durante un breve instante. Las estrellas, los planetas, la vida… existen porque el universo se está deshaciendo.»</w:t>
+        <w:t>«El universo tiende hacia un estado cada vez más desordenado. Y en ese proceso de ir del orden al desorden, la complejidad surge de forma natural durante un breve instante. Las estrellas, los planetas, la vida… existen porque el universo se está deshaciendo.»</w:t>
       </w:r>
     </w:p>
     <w:p>
@@ -1169,7 +780,6 @@
       </w:pPr>
       <w:r>
         <w:rPr>
-          <w:b w:val="0"/>
           <w:i w:val="0"/>
           <w:color w:val="6B7480"/>
           <w:sz w:val="18"/>
@@ -1179,7 +789,7 @@
     </w:p>
     <w:p>
       <w:pPr>
-        <w:spacing w:after="120"/>
+        <w:spacing w:after="120" w:before="0"/>
       </w:pPr>
       <w:r>
         <w:rPr>
@@ -1189,12 +799,39 @@
         <w:t xml:space="preserve">L2: </w:t>
       </w:r>
       <w:r>
-        <w:t>¿Os dais cuenta? No existimos a pesar de que el universo se desordena. Existimos porque se desordena. Somos como los remolinos que se forman en un río mientras el agua baja hacia el mar. Remolinos complejos y preciosos que solo pueden existir porque el agua fluye.</w:t>
+        <w:rPr>
+          <w:i w:val="0"/>
+        </w:rPr>
+        <w:t xml:space="preserve">No existimos </w:t>
+      </w:r>
+      <w:r>
+        <w:rPr>
+          <w:i/>
+        </w:rPr>
+        <w:t>a pesar de</w:t>
+      </w:r>
+      <w:r>
+        <w:rPr>
+          <w:i w:val="0"/>
+        </w:rPr>
+        <w:t xml:space="preserve"> que el universo se desordena, sino </w:t>
+      </w:r>
+      <w:r>
+        <w:rPr>
+          <w:i/>
+        </w:rPr>
+        <w:t>porque</w:t>
+      </w:r>
+      <w:r>
+        <w:rPr>
+          <w:i w:val="0"/>
+        </w:rPr>
+        <w:t xml:space="preserve"> se desordena. Como los remolinos de un río, que solo existen porque el agua fluye.</w:t>
       </w:r>
     </w:p>
     <w:p>
       <w:pPr>
-        <w:spacing w:after="120"/>
+        <w:spacing w:after="120" w:before="0"/>
       </w:pPr>
       <w:r>
         <w:rPr>
@@ -1204,12 +841,15 @@
         <w:t xml:space="preserve">L1: </w:t>
       </w:r>
       <w:r>
-        <w:t>Y eso implica que toda estructura compleja, cada estrella, cada ser vivo, cada uno de nosotros… es necesariamente finita. Necesariamente temporal. Las leyes de la naturaleza nos prohíben ser eternos.</w:t>
+        <w:rPr>
+          <w:i w:val="0"/>
+        </w:rPr>
+        <w:t>Por eso todo lo complejo es necesariamente finito. Lo que nunca se acaba no hace falta cuidarlo; lo raro y lo breve es lo que de verdad vale.</w:t>
       </w:r>
     </w:p>
     <w:p>
       <w:pPr>
-        <w:spacing w:after="120"/>
+        <w:spacing w:after="120" w:before="0"/>
       </w:pPr>
       <w:r>
         <w:rPr>
@@ -1219,97 +859,10 @@
         <w:t xml:space="preserve">L2: </w:t>
       </w:r>
       <w:r>
-        <w:t>Y aquí está la clave. Lo que nunca se acaba no hace falta cuidarlo. Lo que es raro y finito… eso es lo que de verdad vale.</w:t>
-      </w:r>
-    </w:p>
-    <w:p>
-      <w:pPr>
-        <w:spacing w:after="120"/>
-      </w:pPr>
-      <w:r>
         <w:rPr>
-          <w:b/>
-          <w:color w:val="3A64A0"/>
+          <w:i w:val="0"/>
         </w:rPr>
-        <w:t xml:space="preserve">L1: </w:t>
-      </w:r>
-      <w:r>
-        <w:t>Sagan inventó una herramienta preciosa para entender esto: el Calendario Cósmico. Si comprimimos toda la historia del universo en un solo año, con el Big Bang el 1 de enero a medianoche…</w:t>
-      </w:r>
-    </w:p>
-    <w:p>
-      <w:pPr>
-        <w:spacing w:after="120"/>
-      </w:pPr>
-      <w:r>
-        <w:rPr>
-          <w:b/>
-          <w:color w:val="3A64A0"/>
-        </w:rPr>
-        <w:t xml:space="preserve">L2: </w:t>
-      </w:r>
-      <w:r>
-        <w:t>…el Sol y la Tierra no aparecen hasta finales de agosto o principios de septiembre. Los dinosaurios llegan en Navidad. Los primeros seres humanos modernos aparecen el 31 de diciembre, en los últimos minutos antes de las campanadas. Y toda la historia escrita, las pirámides, Grecia, Galileo, nosotros… cabe en los últimos diez segundos del año.</w:t>
-      </w:r>
-    </w:p>
-    <w:p>
-      <w:pPr>
-        <w:spacing w:after="120"/>
-      </w:pPr>
-      <w:r>
-        <w:rPr>
-          <w:b/>
-          <w:color w:val="3A64A0"/>
-        </w:rPr>
-        <w:t xml:space="preserve">L1: </w:t>
-      </w:r>
-      <w:r>
-        <w:t>Diez segundos. Eso es todo lo que llevamos contándonos historias por escrito.</w:t>
-      </w:r>
-    </w:p>
-    <w:p>
-      <w:pPr>
-        <w:spacing w:after="120"/>
-      </w:pPr>
-      <w:r>
-        <w:rPr>
-          <w:b/>
-          <w:color w:val="3A64A0"/>
-        </w:rPr>
-        <w:t xml:space="preserve">L2: </w:t>
-      </w:r>
-      <w:r>
-        <w:t>Y en esos diez segundos hemos medido la edad del universo, hemos pesado galaxias, hemos escuchado el choque de dos agujeros negros a más de mil millones de años luz y hemos dejado huellas en la Luna.</w:t>
-      </w:r>
-    </w:p>
-    <w:p>
-      <w:pPr>
-        <w:spacing w:after="120"/>
-      </w:pPr>
-      <w:r>
-        <w:rPr>
-          <w:b/>
-          <w:color w:val="3A64A0"/>
-        </w:rPr>
-        <w:t xml:space="preserve">L1: </w:t>
-      </w:r>
-      <w:r>
-        <w:t>Si eso no es motivo de esperanza, no sé qué lo es.</w:t>
-      </w:r>
-    </w:p>
-    <w:p>
-      <w:pPr>
-        <w:spacing w:after="120"/>
-      </w:pPr>
-      <w:r>
-        <w:rPr>
-          <w:b/>
-          <w:color w:val="3A64A0"/>
-        </w:rPr>
-        <w:t xml:space="preserve">L2: </w:t>
-      </w:r>
-      <w:r>
-        <w:t>Hay una frase de Sagan, de su novela Contact, que siempre nos viene a la cabeza cuando hablamos de esto.</w:t>
+        <w:t>Sagan lo explicaba con su Calendario Cósmico. Si comprimimos la historia del universo en un año, el Sol no aparece hasta finales de agosto, los dinosaurios llegan en Navidad y los primeros humanos, en los últimos minutos del 31 de diciembre. Toda nuestra historia escrita cabe en los últimos diez segundos de Nochevieja. Y en esos diez segundos hemos medido la edad del cosmos y hemos pisado la Luna.</w:t>
       </w:r>
     </w:p>
     <w:p>
@@ -1320,7 +873,6 @@
       <w:r>
         <w:rPr>
           <w:b/>
-          <w:i w:val="0"/>
           <w:color w:val="3A64A0"/>
           <w:sz w:val="19"/>
         </w:rPr>
@@ -1334,7 +886,6 @@
       </w:pPr>
       <w:r>
         <w:rPr>
-          <w:b w:val="0"/>
           <w:i/>
           <w:color w:val="1B2F4E"/>
           <w:sz w:val="22"/>
@@ -1349,27 +900,27 @@
       </w:pPr>
       <w:r>
         <w:rPr>
-          <w:b w:val="0"/>
           <w:i w:val="0"/>
           <w:color w:val="6B7480"/>
           <w:sz w:val="18"/>
         </w:rPr>
-        <w:t>— Carl Sagan, Contact (1985)</w:t>
+        <w:t xml:space="preserve">— Carl Sagan, </w:t>
       </w:r>
-    </w:p>
-    <w:p>
-      <w:pPr>
-        <w:spacing w:after="120"/>
-      </w:pPr>
       <w:r>
         <w:rPr>
-          <w:b/>
-          <w:color w:val="3A64A0"/>
+          <w:i/>
+          <w:color w:val="6B7480"/>
+          <w:sz w:val="18"/>
         </w:rPr>
-        <w:t xml:space="preserve">L1: </w:t>
+        <w:t>Contact</w:t>
       </w:r>
       <w:r>
-        <w:t>Y quizá eso responda a la pregunta de para qué sirve todo esto. El tiempo que tenemos es breve. Pues entonces, que lo que hagamos con él merezca la pena.</w:t>
+        <w:rPr>
+          <w:i w:val="0"/>
+          <w:color w:val="6B7480"/>
+          <w:sz w:val="18"/>
+        </w:rPr>
+        <w:t xml:space="preserve"> (1985)</w:t>
       </w:r>
     </w:p>
     <w:p>
@@ -1379,7 +930,6 @@
       <w:r>
         <w:rPr>
           <w:b/>
-          <w:i w:val="0"/>
           <w:color w:val="1B2F4E"/>
           <w:sz w:val="26"/>
         </w:rPr>
@@ -1392,7 +942,6 @@
       </w:pPr>
       <w:r>
         <w:rPr>
-          <w:b w:val="0"/>
           <w:i/>
           <w:color w:val="6B7480"/>
           <w:sz w:val="21"/>
@@ -1402,7 +951,36 @@
     </w:p>
     <w:p>
       <w:pPr>
-        <w:spacing w:after="120"/>
+        <w:spacing w:after="120" w:before="0"/>
+      </w:pPr>
+      <w:r>
+        <w:rPr>
+          <w:b/>
+          <w:color w:val="3A64A0"/>
+        </w:rPr>
+        <w:t xml:space="preserve">L1: </w:t>
+      </w:r>
+      <w:r>
+        <w:rPr>
+          <w:i w:val="0"/>
+        </w:rPr>
+        <w:t xml:space="preserve">George Bernard Shaw decía: «Ves cosas y dices: ¿por qué? Pero yo sueño cosas que nunca existieron y digo: ¿por qué no?». Y la ciencia vive ahí, en el </w:t>
+      </w:r>
+      <w:r>
+        <w:rPr>
+          <w:i/>
+        </w:rPr>
+        <w:t>¿por qué no?</w:t>
+      </w:r>
+      <w:r>
+        <w:rPr>
+          <w:i w:val="0"/>
+        </w:rPr>
+      </w:r>
+    </w:p>
+    <w:p>
+      <w:pPr>
+        <w:spacing w:after="120" w:before="0"/>
       </w:pPr>
       <w:r>
         <w:rPr>
@@ -1412,82 +990,10 @@
         <w:t xml:space="preserve">L2: </w:t>
       </w:r>
       <w:r>
-        <w:t>Hay una frase de George Bernard Shaw que dice: «Ves cosas y dices: ¿por qué? Pero yo sueño cosas que nunca existieron y digo: ¿por qué no?».</w:t>
-      </w:r>
-    </w:p>
-    <w:p>
-      <w:pPr>
-        <w:spacing w:after="120"/>
-      </w:pPr>
-      <w:r>
         <w:rPr>
-          <w:b/>
-          <w:color w:val="3A64A0"/>
+          <w:i w:val="0"/>
         </w:rPr>
-        <w:t xml:space="preserve">L1: </w:t>
-      </w:r>
-      <w:r>
-        <w:t>Y creo que define la ciencia mucho mejor de lo que solemos pensar. La ciencia no trata solo del porqué. Trata, sobre todo, del ¿por qué no?</w:t>
-      </w:r>
-    </w:p>
-    <w:p>
-      <w:pPr>
-        <w:spacing w:after="120"/>
-      </w:pPr>
-      <w:r>
-        <w:rPr>
-          <w:b/>
-          <w:color w:val="3A64A0"/>
-        </w:rPr>
-        <w:t xml:space="preserve">L2: </w:t>
-      </w:r>
-      <w:r>
-        <w:t>¿Por qué no va a poder volar el ser humano? ¿Por qué no vamos a ir a la Luna? ¿Por qué no van a estar hechas las estrellas de algo distinto de lo que todo el mundo cree? ¿Por qué no va a poder curvarse el espacio?</w:t>
-      </w:r>
-    </w:p>
-    <w:p>
-      <w:pPr>
-        <w:spacing w:after="120"/>
-      </w:pPr>
-      <w:r>
-        <w:rPr>
-          <w:b/>
-          <w:color w:val="3A64A0"/>
-        </w:rPr>
-        <w:t xml:space="preserve">L1: </w:t>
-      </w:r>
-      <w:r>
-        <w:t>Ese último «por qué no» es el de Einstein. Se atrevió a imaginar que la gravedad no es una fuerza misteriosa que tira de las cosas, sino la forma misma del espacio y del tiempo, curvados por la masa.</w:t>
-      </w:r>
-    </w:p>
-    <w:p>
-      <w:pPr>
-        <w:spacing w:after="120"/>
-      </w:pPr>
-      <w:r>
-        <w:rPr>
-          <w:b/>
-          <w:color w:val="3A64A0"/>
-        </w:rPr>
-        <w:t xml:space="preserve">L2: </w:t>
-      </w:r>
-      <w:r>
-        <w:t>Una idea que funciona igual para una manzana que cae de un árbol que para el agujero negro más masivo del universo.</w:t>
-      </w:r>
-    </w:p>
-    <w:p>
-      <w:pPr>
-        <w:spacing w:after="120"/>
-      </w:pPr>
-      <w:r>
-        <w:rPr>
-          <w:b/>
-          <w:color w:val="3A64A0"/>
-        </w:rPr>
-        <w:t xml:space="preserve">L1: </w:t>
-      </w:r>
-      <w:r>
-        <w:t>Y Brian Cox tiene una frase sobre esto que nos parece una declaración de principios para cualquiera que ame el conocimiento.</w:t>
+        <w:t>¿Por qué no van a estar hechas las estrellas de algo distinto de lo que todos creen? ¿Por qué no va a curvarse el espacio, como se atrevió a imaginar Einstein?</w:t>
       </w:r>
     </w:p>
     <w:p>
@@ -1498,7 +1004,6 @@
       <w:r>
         <w:rPr>
           <w:b/>
-          <w:i w:val="0"/>
           <w:color w:val="3A64A0"/>
           <w:sz w:val="19"/>
         </w:rPr>
@@ -1512,7 +1017,6 @@
       </w:pPr>
       <w:r>
         <w:rPr>
-          <w:b w:val="0"/>
           <w:i/>
           <w:color w:val="1B2F4E"/>
           <w:sz w:val="22"/>
@@ -1527,7 +1031,6 @@
       </w:pPr>
       <w:r>
         <w:rPr>
-          <w:b w:val="0"/>
           <w:i w:val="0"/>
           <w:color w:val="6B7480"/>
           <w:sz w:val="18"/>
@@ -1537,22 +1040,7 @@
     </w:p>
     <w:p>
       <w:pPr>
-        <w:spacing w:after="120"/>
-      </w:pPr>
-      <w:r>
-        <w:rPr>
-          <w:b/>
-          <w:color w:val="3A64A0"/>
-        </w:rPr>
-        <w:t xml:space="preserve">L2: </w:t>
-      </w:r>
-      <w:r>
-        <w:t>Fijaos: no dice que el lugar más bello sea tener todas las respuestas. Dice que es estar en el borde. En la duda.</w:t>
-      </w:r>
-    </w:p>
-    <w:p>
-      <w:pPr>
-        <w:spacing w:after="120"/>
+        <w:spacing w:after="120" w:before="0"/>
       </w:pPr>
       <w:r>
         <w:rPr>
@@ -1562,7 +1050,10 @@
         <w:t xml:space="preserve">L1: </w:t>
       </w:r>
       <w:r>
-        <w:t>Richard Feynman, otro gigante de la física, pensaba algo muy parecido.</w:t>
+        <w:rPr>
+          <w:i w:val="0"/>
+        </w:rPr>
+        <w:t>No dice que lo más bello sea tener todas las respuestas, sino estar en el borde. En la duda. Richard Feynman pensaba igual.</w:t>
       </w:r>
     </w:p>
     <w:p>
@@ -1573,7 +1064,6 @@
       <w:r>
         <w:rPr>
           <w:b/>
-          <w:i w:val="0"/>
           <w:color w:val="3A64A0"/>
           <w:sz w:val="19"/>
         </w:rPr>
@@ -1587,7 +1077,6 @@
       </w:pPr>
       <w:r>
         <w:rPr>
-          <w:b w:val="0"/>
           <w:i/>
           <w:color w:val="1B2F4E"/>
           <w:sz w:val="22"/>
@@ -1602,7 +1091,6 @@
       </w:pPr>
       <w:r>
         <w:rPr>
-          <w:b w:val="0"/>
           <w:i w:val="0"/>
           <w:color w:val="6B7480"/>
           <w:sz w:val="18"/>
@@ -1612,7 +1100,7 @@
     </w:p>
     <w:p>
       <w:pPr>
-        <w:spacing w:after="120"/>
+        <w:spacing w:after="120" w:before="0"/>
       </w:pPr>
       <w:r>
         <w:rPr>
@@ -1622,12 +1110,39 @@
         <w:t xml:space="preserve">L2: </w:t>
       </w:r>
       <w:r>
-        <w:t>Y esto nos lleva a algo de lo que se habla poco. A veces la ciencia se presenta como un muro de certezas, un lugar frío donde alguien con bata te dice lo que es verdad y se ríe de quien no lo sabe.</w:t>
+        <w:rPr>
+          <w:i w:val="0"/>
+        </w:rPr>
+        <w:t xml:space="preserve">Las universidades nacieron así, con la </w:t>
+      </w:r>
+      <w:r>
+        <w:rPr>
+          <w:i/>
+        </w:rPr>
+        <w:t>lectio</w:t>
+      </w:r>
+      <w:r>
+        <w:rPr>
+          <w:i w:val="0"/>
+        </w:rPr>
+        <w:t xml:space="preserve"> y la </w:t>
+      </w:r>
+      <w:r>
+        <w:rPr>
+          <w:i/>
+        </w:rPr>
+        <w:t>disputatio</w:t>
+      </w:r>
+      <w:r>
+        <w:rPr>
+          <w:i w:val="0"/>
+        </w:rPr>
+        <w:t>: leer y después discutir con argumentos, no con burlas.</w:t>
       </w:r>
     </w:p>
     <w:p>
       <w:pPr>
-        <w:spacing w:after="120"/>
+        <w:spacing w:after="120" w:before="0"/>
       </w:pPr>
       <w:r>
         <w:rPr>
@@ -1637,12 +1152,15 @@
         <w:t xml:space="preserve">L1: </w:t>
       </w:r>
       <w:r>
-        <w:t>Y no es así. La ciencia en la que creemos es la de la pregunta, el debate y la escucha. Las universidades, de hecho, nacieron así en la Edad Media, con la lectio y la disputatio: primero se leía y después se discutía. Se rebatía con argumentos, no con burlas.</w:t>
+        <w:rPr>
+          <w:i w:val="0"/>
+        </w:rPr>
+        <w:t>Rousseau lo resumía muy bien: «Prefiero ser un hombre de paradojas que un hombre de prejuicios». La ciencia se equivoca, y no pasa nada: corregirse es su mayor virtud. Nadie es dueño de la verdad.</w:t>
       </w:r>
     </w:p>
     <w:p>
       <w:pPr>
-        <w:spacing w:after="120"/>
+        <w:spacing w:after="120" w:before="0"/>
       </w:pPr>
       <w:r>
         <w:rPr>
@@ -1652,187 +1170,10 @@
         <w:t xml:space="preserve">L2: </w:t>
       </w:r>
       <w:r>
-        <w:t>Hay una frase de Rousseau que nos encanta: «Prefiero ser un hombre de paradojas que un hombre de prejuicios».</w:t>
-      </w:r>
-    </w:p>
-    <w:p>
-      <w:pPr>
-        <w:spacing w:after="120"/>
-      </w:pPr>
-      <w:r>
         <w:rPr>
-          <w:b/>
-          <w:color w:val="3A64A0"/>
+          <w:i w:val="0"/>
         </w:rPr>
-        <w:t xml:space="preserve">L1: </w:t>
-      </w:r>
-      <w:r>
-        <w:t>Porque la historia de la ciencia está llena de ideas ridiculizadas que acabaron siendo ciertas. La deriva de los continentes que propuso Alfred Wegener, que tardó medio siglo en aceptarse. La propia Cecilia Payne de la que hablábamos antes.</w:t>
-      </w:r>
-    </w:p>
-    <w:p>
-      <w:pPr>
-        <w:spacing w:after="120"/>
-      </w:pPr>
-      <w:r>
-        <w:rPr>
-          <w:b/>
-          <w:color w:val="3A64A0"/>
-        </w:rPr>
-        <w:t xml:space="preserve">L2: </w:t>
-      </w:r>
-      <w:r>
-        <w:t>Y también está llena de ideas que parecían ciertas y no lo eran. La ciencia se equivoca. Y no pasa nada. Es más, esa capacidad de corregirse es su mayor virtud. Nadie es dueño de la verdad. La verdad es un horizonte hacia el que caminamos juntos.</w:t>
-      </w:r>
-    </w:p>
-    <w:p>
-      <w:pPr>
-        <w:spacing w:after="120"/>
-      </w:pPr>
-      <w:r>
-        <w:rPr>
-          <w:b/>
-          <w:color w:val="3A64A0"/>
-        </w:rPr>
-        <w:t xml:space="preserve">L1: </w:t>
-      </w:r>
-      <w:r>
-        <w:t>Los antiguos lo decían así: amigo de Platón, amigo de Aristóteles, pero más amigo de la verdad.</w:t>
-      </w:r>
-    </w:p>
-    <w:p>
-      <w:pPr>
-        <w:spacing w:after="120"/>
-      </w:pPr>
-      <w:r>
-        <w:rPr>
-          <w:b/>
-          <w:color w:val="3A64A0"/>
-        </w:rPr>
-        <w:t xml:space="preserve">L2: </w:t>
-      </w:r>
-      <w:r>
-        <w:t>El físico Jorge Wagensberg, que dirigió durante muchos años el Museo de la Ciencia de Barcelona, hablaba de tres formas de conocimiento: la ciencia, el arte y la revelación, entendida en sentido amplio, como intuición. Y advertía de que, cuando cada disciplina se encierra en sí misma, el pensamiento se seca.</w:t>
-      </w:r>
-    </w:p>
-    <w:p>
-      <w:pPr>
-        <w:spacing w:after="20" w:before="0"/>
-        <w:ind w:left="680"/>
-      </w:pPr>
-      <w:r>
-        <w:rPr>
-          <w:b/>
-          <w:i w:val="0"/>
-          <w:color w:val="3A64A0"/>
-          <w:sz w:val="19"/>
-        </w:rPr>
-        <w:t>Eco 4.3 (Jorge Wagensberg)</w:t>
-      </w:r>
-    </w:p>
-    <w:p>
-      <w:pPr>
-        <w:spacing w:after="20" w:before="0"/>
-        <w:ind w:left="680"/>
-      </w:pPr>
-      <w:r>
-        <w:rPr>
-          <w:b w:val="0"/>
-          <w:i/>
-          <w:color w:val="1B2F4E"/>
-          <w:sz w:val="22"/>
-        </w:rPr>
-        <w:t>«Cuando las fronteras interdisciplinarias se hacen impermeables […] es cuando el rigor científico se confunde con el rigor mortis.»</w:t>
-      </w:r>
-    </w:p>
-    <w:p>
-      <w:pPr>
-        <w:spacing w:after="160" w:before="0"/>
-        <w:ind w:left="680"/>
-      </w:pPr>
-      <w:r>
-        <w:rPr>
-          <w:b w:val="0"/>
-          <w:i w:val="0"/>
-          <w:color w:val="6B7480"/>
-          <w:sz w:val="18"/>
-        </w:rPr>
-        <w:t>— Jorge Wagensberg, El pensador intruso</w:t>
-      </w:r>
-    </w:p>
-    <w:p>
-      <w:pPr>
-        <w:spacing w:after="120"/>
-      </w:pPr>
-      <w:r>
-        <w:rPr>
-          <w:b/>
-          <w:color w:val="3A64A0"/>
-        </w:rPr>
-        <w:t xml:space="preserve">L1: </w:t>
-      </w:r>
-      <w:r>
-        <w:t>Por eso esta sección se llama Cosmosofía y no Cosmología. Queremos que aquí quepan la física, la filosofía, la poesía y las preguntas que todavía no tienen respuesta. Porque mirar al cielo nunca ha sido solo cosa de científicos. Es cosa de seres humanos.</w:t>
-      </w:r>
-    </w:p>
-    <w:p>
-      <w:pPr>
-        <w:spacing w:after="120"/>
-      </w:pPr>
-      <w:r>
-        <w:rPr>
-          <w:b/>
-          <w:color w:val="3A64A0"/>
-        </w:rPr>
-        <w:t xml:space="preserve">L2: </w:t>
-      </w:r>
-      <w:r>
-        <w:t>Y Sagan, que de esto sabía mucho, lo dejó escrito.</w:t>
-      </w:r>
-    </w:p>
-    <w:p>
-      <w:pPr>
-        <w:spacing w:after="20" w:before="0"/>
-        <w:ind w:left="680"/>
-      </w:pPr>
-      <w:r>
-        <w:rPr>
-          <w:b/>
-          <w:i w:val="0"/>
-          <w:color w:val="3A64A0"/>
-          <w:sz w:val="19"/>
-        </w:rPr>
-        <w:t>Eco 4.4 (Carl Sagan)</w:t>
-      </w:r>
-    </w:p>
-    <w:p>
-      <w:pPr>
-        <w:spacing w:after="20" w:before="0"/>
-        <w:ind w:left="680"/>
-      </w:pPr>
-      <w:r>
-        <w:rPr>
-          <w:b w:val="0"/>
-          <w:i/>
-          <w:color w:val="1B2F4E"/>
-          <w:sz w:val="22"/>
-        </w:rPr>
-        <w:t>«La ciencia no solo es compatible con la espiritualidad: es una profunda fuente de espiritualidad.»</w:t>
-      </w:r>
-    </w:p>
-    <w:p>
-      <w:pPr>
-        <w:spacing w:after="160" w:before="0"/>
-        <w:ind w:left="680"/>
-      </w:pPr>
-      <w:r>
-        <w:rPr>
-          <w:b w:val="0"/>
-          <w:i w:val="0"/>
-          <w:color w:val="6B7480"/>
-          <w:sz w:val="18"/>
-        </w:rPr>
-        <w:t>— Carl Sagan, El mundo y sus demonios (1995)</w:t>
+        <w:t>Por eso esto se llama Cosmosofía. Aquí caben la física, la filosofía y las preguntas que aún no tienen respuesta. Como escribió Sagan, la ciencia es una profunda fuente de espiritualidad.</w:t>
       </w:r>
     </w:p>
     <w:p>
@@ -1842,7 +1183,6 @@
       <w:r>
         <w:rPr>
           <w:b/>
-          <w:i w:val="0"/>
           <w:color w:val="1B2F4E"/>
           <w:sz w:val="26"/>
         </w:rPr>
@@ -1855,7 +1195,6 @@
       </w:pPr>
       <w:r>
         <w:rPr>
-          <w:b w:val="0"/>
           <w:i/>
           <w:color w:val="6B7480"/>
           <w:sz w:val="21"/>
@@ -1865,22 +1204,7 @@
     </w:p>
     <w:p>
       <w:pPr>
-        <w:spacing w:after="120"/>
-      </w:pPr>
-      <w:r>
-        <w:rPr>
-          <w:b/>
-          <w:color w:val="3A64A0"/>
-        </w:rPr>
-        <w:t xml:space="preserve">L1: </w:t>
-      </w:r>
-      <w:r>
-        <w:t>Vamos acabando, y queremos bajar todo esto a tierra. Literalmente.</w:t>
-      </w:r>
-    </w:p>
-    <w:p>
-      <w:pPr>
-        <w:spacing w:after="120"/>
+        <w:spacing w:after="120" w:before="0"/>
       </w:pPr>
       <w:r>
         <w:rPr>
@@ -1890,22 +1214,10 @@
         <w:t xml:space="preserve">L2: </w:t>
       </w:r>
       <w:r>
-        <w:t>Porque vivimos un momento curioso. Tenemos más información que nunca y, a la vez, parece que nos escuchamos menos que nunca. Todo son bandos, etiquetas y ruido. Ganar la discusión en un mensaje de diez segundos en lugar de intentar entender al otro.</w:t>
-      </w:r>
-    </w:p>
-    <w:p>
-      <w:pPr>
-        <w:spacing w:after="120"/>
-      </w:pPr>
-      <w:r>
         <w:rPr>
-          <w:b/>
-          <w:color w:val="3A64A0"/>
+          <w:i w:val="0"/>
         </w:rPr>
-        <w:t xml:space="preserve">L1: </w:t>
-      </w:r>
-      <w:r>
-        <w:t>Y cuando uno vuelve a esa foto del punto azul pálido, todo eso se ve de otra manera. Sagan lo decía con una claridad que impresiona.</w:t>
+        <w:t>Vivimos un tiempo de bandos y de ruido, de ganar discusiones en vez de entendernos. Y desde aquel píxel de la Voyager, todo eso se ve de otra manera.</w:t>
       </w:r>
     </w:p>
     <w:p>
@@ -1916,7 +1228,6 @@
       <w:r>
         <w:rPr>
           <w:b/>
-          <w:i w:val="0"/>
           <w:color w:val="3A64A0"/>
           <w:sz w:val="19"/>
         </w:rPr>
@@ -1930,12 +1241,11 @@
       </w:pPr>
       <w:r>
         <w:rPr>
-          <w:b w:val="0"/>
           <w:i/>
           <w:color w:val="1B2F4E"/>
           <w:sz w:val="22"/>
         </w:rPr>
-        <w:t>«Pensad en los ríos de sangre derramados por todos esos generales y emperadores para que, en su gloria y su triunfo, pudieran convertirse en los amos momentáneos de una fracción de un punto. […] Para mí, esto subraya nuestra responsabilidad de tratarnos mejor los unos a los otros, y de preservar y querer ese punto azul pálido, el único hogar que hemos conocido.»</w:t>
+        <w:t>«Para mí, esto subraya nuestra responsabilidad de tratarnos mejor los unos a los otros, y de preservar y querer ese punto azul pálido, el único hogar que hemos conocido.»</w:t>
       </w:r>
     </w:p>
     <w:p>
@@ -1945,17 +1255,50 @@
       </w:pPr>
       <w:r>
         <w:rPr>
-          <w:b w:val="0"/>
           <w:i w:val="0"/>
           <w:color w:val="6B7480"/>
           <w:sz w:val="18"/>
         </w:rPr>
-        <w:t>— Carl Sagan, Un punto azul pálido (1994)</w:t>
+        <w:t xml:space="preserve">— Carl Sagan, </w:t>
+      </w:r>
+      <w:r>
+        <w:rPr>
+          <w:i/>
+          <w:color w:val="6B7480"/>
+          <w:sz w:val="18"/>
+        </w:rPr>
+        <w:t>Un punto azul pálido</w:t>
+      </w:r>
+      <w:r>
+        <w:rPr>
+          <w:i w:val="0"/>
+          <w:color w:val="6B7480"/>
+          <w:sz w:val="18"/>
+        </w:rPr>
+        <w:t xml:space="preserve"> (1994)</w:t>
       </w:r>
     </w:p>
     <w:p>
       <w:pPr>
-        <w:spacing w:after="120"/>
+        <w:spacing w:after="120" w:before="0"/>
+      </w:pPr>
+      <w:r>
+        <w:rPr>
+          <w:b/>
+          <w:color w:val="3A64A0"/>
+        </w:rPr>
+        <w:t xml:space="preserve">L1: </w:t>
+      </w:r>
+      <w:r>
+        <w:rPr>
+          <w:i w:val="0"/>
+        </w:rPr>
+        <w:t>Muchos astronautas cuentan algo parecido. Lo llaman el «efecto perspectiva»: ven la Tierra desde fuera, sin fronteras dibujadas, con una atmósfera tan fina como una piel… y vuelven sintiendo que lo que nos separa es pequeñísimo al lado de lo que compartimos.</w:t>
+      </w:r>
+    </w:p>
+    <w:p>
+      <w:pPr>
+        <w:spacing w:after="120" w:before="0"/>
       </w:pPr>
       <w:r>
         <w:rPr>
@@ -1965,12 +1308,15 @@
         <w:t xml:space="preserve">L2: </w:t>
       </w:r>
       <w:r>
-        <w:t>Muchos astronautas cuentan algo parecido. Lo llaman el «efecto perspectiva». Ven la Tierra desde fuera, sin fronteras dibujadas, con esa capa de atmósfera tan fina como una piel… y vuelven cambiados. Con la sensación de que todo lo que nos separa es pequeñísimo al lado de lo que compartimos.</w:t>
+        <w:rPr>
+          <w:i w:val="0"/>
+        </w:rPr>
+        <w:t>Y si quizá somos la única civilización de la galaxia, no podemos permitirnos el desprecio. Somos demasiado escasos y valiosos para malgastarnos odiándonos.</w:t>
       </w:r>
     </w:p>
     <w:p>
       <w:pPr>
-        <w:spacing w:after="120"/>
+        <w:spacing w:after="120" w:before="0"/>
       </w:pPr>
       <w:r>
         <w:rPr>
@@ -1980,37 +1326,10 @@
         <w:t xml:space="preserve">L1: </w:t>
       </w:r>
       <w:r>
-        <w:t>Todos los que alguna vez han discutido, todos los que alguna vez se han querido, viven en ese mismo píxel.</w:t>
-      </w:r>
-    </w:p>
-    <w:p>
-      <w:pPr>
-        <w:spacing w:after="120"/>
-      </w:pPr>
-      <w:r>
         <w:rPr>
-          <w:b/>
-          <w:color w:val="3A64A0"/>
+          <w:i w:val="0"/>
         </w:rPr>
-        <w:t xml:space="preserve">L2: </w:t>
-      </w:r>
-      <w:r>
-        <w:t>Y si somos, como decía Cox, quizá la única civilización de la galaxia… entonces no nos lo podemos permitir. No podemos permitirnos el desprecio. Somos demasiado escasos y demasiado valiosos como para malgastarnos odiándonos.</w:t>
-      </w:r>
-    </w:p>
-    <w:p>
-      <w:pPr>
-        <w:spacing w:after="120"/>
-      </w:pPr>
-      <w:r>
-        <w:rPr>
-          <w:b/>
-          <w:color w:val="3A64A0"/>
-        </w:rPr>
-        <w:t xml:space="preserve">L1: </w:t>
-      </w:r>
-      <w:r>
-        <w:t>Escuchar con respeto al que piensa distinto no significa darle la razón. Significa reconocer que los dos estamos sobre el mismo punto azul, haciéndonos las mismas preguntas desde lugares diferentes.</w:t>
+        <w:t>Escuchar al que piensa distinto no es darle la razón. Es reconocer que compartimos el mismo punto azul.</w:t>
       </w:r>
     </w:p>
     <w:p>
@@ -2020,7 +1339,6 @@
       <w:r>
         <w:rPr>
           <w:b/>
-          <w:i w:val="0"/>
           <w:color w:val="1B2F4E"/>
           <w:sz w:val="26"/>
         </w:rPr>
@@ -2033,7 +1351,6 @@
       </w:pPr>
       <w:r>
         <w:rPr>
-          <w:b w:val="0"/>
           <w:i/>
           <w:color w:val="6B7480"/>
           <w:sz w:val="21"/>
@@ -2043,7 +1360,25 @@
     </w:p>
     <w:p>
       <w:pPr>
-        <w:spacing w:after="120"/>
+        <w:spacing w:after="120" w:before="0"/>
+      </w:pPr>
+      <w:r>
+        <w:rPr>
+          <w:b/>
+          <w:color w:val="3A64A0"/>
+        </w:rPr>
+        <w:t xml:space="preserve">L1: </w:t>
+      </w:r>
+      <w:r>
+        <w:rPr>
+          <w:i w:val="0"/>
+        </w:rPr>
+        <w:t>Os dejamos una tarea. Esta noche, si está despejado, salid y mirad arriba cinco minutos. Sin móvil.</w:t>
+      </w:r>
+    </w:p>
+    <w:p>
+      <w:pPr>
+        <w:spacing w:after="120" w:before="0"/>
       </w:pPr>
       <w:r>
         <w:rPr>
@@ -2053,12 +1388,15 @@
         <w:t xml:space="preserve">L2: </w:t>
       </w:r>
       <w:r>
-        <w:t>Así que hoy queremos dejaros una tarea. Muy sencilla.</w:t>
+        <w:rPr>
+          <w:i w:val="0"/>
+        </w:rPr>
+        <w:t>Buscad la estrella más brillante y pensad que esa luz salió de allí hace años, a veces siglos: estáis mirando el pasado.</w:t>
       </w:r>
     </w:p>
     <w:p>
       <w:pPr>
-        <w:spacing w:after="120"/>
+        <w:spacing w:after="120" w:before="0"/>
       </w:pPr>
       <w:r>
         <w:rPr>
@@ -2068,12 +1406,15 @@
         <w:t xml:space="preserve">L1: </w:t>
       </w:r>
       <w:r>
-        <w:t>Esta noche, o la próxima que esté despejada, salid fuera. Aunque sea al balcón. Y mirad arriba durante cinco minutos. Sin móvil.</w:t>
+        <w:rPr>
+          <w:i w:val="0"/>
+        </w:rPr>
+        <w:t>Y si tenéis un cielo oscuro, buscad en la constelación de Andrómeda una manchita difusa: es otra galaxia, y su luz ha viajado dos millones y medio de años hasta vuestros ojos.</w:t>
       </w:r>
     </w:p>
     <w:p>
       <w:pPr>
-        <w:spacing w:after="120"/>
+        <w:spacing w:after="120" w:before="0"/>
       </w:pPr>
       <w:r>
         <w:rPr>
@@ -2083,96 +1424,10 @@
         <w:t xml:space="preserve">L2: </w:t>
       </w:r>
       <w:r>
-        <w:t>Buscad la estrella más brillante que veáis y pensad que esa luz salió de allí hace años, a veces siglos. Que estáis mirando el pasado.</w:t>
-      </w:r>
-    </w:p>
-    <w:p>
-      <w:pPr>
-        <w:spacing w:after="120"/>
-      </w:pPr>
-      <w:r>
         <w:rPr>
-          <w:b/>
-          <w:color w:val="3A64A0"/>
+          <w:i w:val="0"/>
         </w:rPr>
-        <w:t xml:space="preserve">L1: </w:t>
-      </w:r>
-      <w:r>
-        <w:t>Y si tenéis un cielo oscuro, en estas noches de otoño buscad una manchita difusa en la constelación de Andrómeda. Es otra galaxia. Su luz ha viajado dos millones y medio de años para acabar en vuestros ojos. Salió de allí cuando los primeros miembros de nuestro linaje apenas daban sus primeros pasos en África.</w:t>
-      </w:r>
-    </w:p>
-    <w:p>
-      <w:pPr>
-        <w:spacing w:after="120"/>
-      </w:pPr>
-      <w:r>
-        <w:rPr>
-          <w:b/>
-          <w:color w:val="3A64A0"/>
-        </w:rPr>
-        <w:t xml:space="preserve">L2: </w:t>
-      </w:r>
-      <w:r>
-        <w:t>Y pensad que estáis hechos de lo mismo que esas estrellas. Que sois, durante un momento breve y precioso, la forma que tiene el universo de mirarse a sí mismo.</w:t>
-      </w:r>
-    </w:p>
-    <w:p>
-      <w:pPr>
-        <w:spacing w:after="120"/>
-      </w:pPr>
-      <w:r>
-        <w:rPr>
-          <w:b/>
-          <w:color w:val="3A64A0"/>
-        </w:rPr>
-        <w:t xml:space="preserve">L1: </w:t>
-      </w:r>
-      <w:r>
-        <w:t>No sabemos si el cosmos tiene un sentido. Quizá esa pregunta no tenga respuesta. Pero sí sabemos algo: nosotros podemos dárselo. Con lo que aprendemos, con lo que creamos y con cómo nos tratamos.</w:t>
-      </w:r>
-    </w:p>
-    <w:p>
-      <w:pPr>
-        <w:spacing w:after="120"/>
-      </w:pPr>
-      <w:r>
-        <w:rPr>
-          <w:b/>
-          <w:color w:val="3A64A0"/>
-        </w:rPr>
-        <w:t xml:space="preserve">L2: </w:t>
-      </w:r>
-      <w:r>
-        <w:t>Brian Cox suele decir que lo verdaderamente asombroso no es lo grande que es el universo, sino que en él hayan aparecido cosas capaces de comprenderlo. Y nosotros somos una de ellas.</w:t>
-      </w:r>
-    </w:p>
-    <w:p>
-      <w:pPr>
-        <w:spacing w:after="120"/>
-      </w:pPr>
-      <w:r>
-        <w:rPr>
-          <w:b/>
-          <w:color w:val="3A64A0"/>
-        </w:rPr>
-        <w:t xml:space="preserve">L1: </w:t>
-      </w:r>
-      <w:r>
-        <w:t>Esto ha sido Cosmosofía. Gracias por mirar arriba con nosotros.</w:t>
-      </w:r>
-    </w:p>
-    <w:p>
-      <w:pPr>
-        <w:spacing w:after="120" w:before="0"/>
-      </w:pPr>
-      <w:r>
-        <w:rPr>
-          <w:b w:val="0"/>
-          <w:i w:val="0"/>
-          <w:color w:val="6B7480"/>
-          <w:sz w:val="19"/>
-        </w:rPr>
-        <w:t>[SUBE LA MÚSICA · SE FUNDE LENTAMENTE]</w:t>
+        <w:t>Y pensad que estáis hechos de lo mismo que esas estrellas. No sabemos si el cosmos tiene un sentido, pero nosotros podemos dárselo: con lo que aprendemos, con lo que creamos y con cómo nos tratamos.</w:t>
       </w:r>
     </w:p>
     <w:p>
@@ -2182,7 +1437,6 @@
       <w:r>
         <w:rPr>
           <w:b/>
-          <w:i w:val="0"/>
           <w:color w:val="1B2F4E"/>
           <w:sz w:val="26"/>
         </w:rPr>
@@ -2195,17 +1449,34 @@
       </w:pPr>
       <w:r>
         <w:rPr>
-          <w:b w:val="0"/>
           <w:i/>
           <w:color w:val="6B7480"/>
           <w:sz w:val="21"/>
         </w:rPr>
-        <w:t>Saludos astronómicos</w:t>
+        <w:t>Per aspera ad astra</w:t>
       </w:r>
     </w:p>
     <w:p>
       <w:pPr>
-        <w:spacing w:after="120"/>
+        <w:spacing w:after="120" w:before="0"/>
+      </w:pPr>
+      <w:r>
+        <w:rPr>
+          <w:b/>
+          <w:color w:val="3A64A0"/>
+        </w:rPr>
+        <w:t xml:space="preserve">L1: </w:t>
+      </w:r>
+      <w:r>
+        <w:rPr>
+          <w:i w:val="0"/>
+        </w:rPr>
+        <w:t>Esto ha sido Cosmosofía. Gracias por mirar arriba con nosotros.</w:t>
+      </w:r>
+    </w:p>
+    <w:p>
+      <w:pPr>
+        <w:spacing w:after="120" w:before="0"/>
       </w:pPr>
       <w:r>
         <w:rPr>
@@ -2215,12 +1486,27 @@
         <w:t xml:space="preserve">L2: </w:t>
       </w:r>
       <w:r>
-        <w:t>Y aquí acaba el programa de hoy. Antes de despedirnos, queremos dar las gracias a Daniel Martín Guerrero, autor del guion de esta nueva sección.</w:t>
+        <w:rPr>
+          <w:i w:val="0"/>
+        </w:rPr>
+        <w:t xml:space="preserve">Y recordad la vieja expresión latina: </w:t>
+      </w:r>
+      <w:r>
+        <w:rPr>
+          <w:i/>
+        </w:rPr>
+        <w:t>per aspera ad astra</w:t>
+      </w:r>
+      <w:r>
+        <w:rPr>
+          <w:i w:val="0"/>
+        </w:rPr>
+        <w:t>. A través de las dificultades, hasta las estrellas.</w:t>
       </w:r>
     </w:p>
     <w:p>
       <w:pPr>
-        <w:spacing w:after="120"/>
+        <w:spacing w:after="120" w:before="0"/>
       </w:pPr>
       <w:r>
         <w:rPr>
@@ -2230,57 +1516,15 @@
         <w:t xml:space="preserve">L1: </w:t>
       </w:r>
       <w:r>
-        <w:t>Nosotros hemos sido: … y …</w:t>
+        <w:rPr>
+          <w:i w:val="0"/>
+        </w:rPr>
+        <w:t>Porque el camino nunca es fácil… pero siempre merece la pena mirar hacia arriba.</w:t>
       </w:r>
     </w:p>
     <w:p>
       <w:pPr>
-        <w:spacing w:after="120"/>
-      </w:pPr>
-      <w:r>
-        <w:rPr>
-          <w:b/>
-          <w:color w:val="3A64A0"/>
-        </w:rPr>
-        <w:t xml:space="preserve">L2: </w:t>
-      </w:r>
-      <w:r>
-        <w:t>Gracias también a RadioUSAL por cedernos un espacio para producir programas con la mayor calidad posible.</w:t>
-      </w:r>
-    </w:p>
-    <w:p>
-      <w:pPr>
-        <w:spacing w:after="120"/>
-      </w:pPr>
-      <w:r>
-        <w:rPr>
-          <w:b/>
-          <w:color w:val="3A64A0"/>
-        </w:rPr>
-        <w:t xml:space="preserve">L1: </w:t>
-      </w:r>
-      <w:r>
-        <w:t>Os recordamos que podéis estar al tanto de las actividades de la Asociación en nuestras redes sociales. Podéis seguirnos en Twitter, @SupernovaUsal; en Instagram, supernovausal; y en Facebook, AU Supernova.</w:t>
-      </w:r>
-    </w:p>
-    <w:p>
-      <w:pPr>
-        <w:spacing w:after="120"/>
-      </w:pPr>
-      <w:r>
-        <w:rPr>
-          <w:b/>
-          <w:color w:val="3A64A0"/>
-        </w:rPr>
-        <w:t xml:space="preserve">L2: </w:t>
-      </w:r>
-      <w:r>
-        <w:t>Si queréis escuchar capítulos anteriores, podéis encontrarnos en Ivoox y Spotify como Radioacción Cósmica. Y podéis visitar también nuestro canal de YouTube, Supernova USAL. Eso es todo por hoy. Nos vemos el mes que viene y muchas gracias por escucharnos.</w:t>
-      </w:r>
-    </w:p>
-    <w:p>
-      <w:pPr>
-        <w:spacing w:after="120"/>
+        <w:spacing w:after="120" w:before="0"/>
       </w:pPr>
       <w:r>
         <w:rPr>
@@ -2290,7 +1534,22 @@
         <w:t xml:space="preserve">L1 y L2: </w:t>
       </w:r>
       <w:r>
-        <w:t>¡Saludos astronómicos!</w:t>
+        <w:rPr>
+          <w:i w:val="0"/>
+        </w:rPr>
+        <w:t>¡</w:t>
+      </w:r>
+      <w:r>
+        <w:rPr>
+          <w:i/>
+        </w:rPr>
+        <w:t>Ad astra</w:t>
+      </w:r>
+      <w:r>
+        <w:rPr>
+          <w:i w:val="0"/>
+        </w:rPr>
+        <w:t>!</w:t>
       </w:r>
     </w:p>
     <w:p>
@@ -2299,209 +1558,11 @@
       </w:pPr>
       <w:r>
         <w:rPr>
-          <w:b w:val="0"/>
           <w:i w:val="0"/>
           <w:color w:val="6B7480"/>
           <w:sz w:val="19"/>
         </w:rPr>
-        <w:t>[SINTONÍA DE CIERRE]</w:t>
-      </w:r>
-    </w:p>
-    <w:p>
-      <w:pPr>
-        <w:spacing w:after="120" w:before="360"/>
-      </w:pPr>
-      <w:r>
-        <w:rPr>
-          <w:b/>
-          <w:i w:val="0"/>
-          <w:color w:val="1B2F4E"/>
-          <w:sz w:val="26"/>
-        </w:rPr>
-        <w:t>FUENTES Y CITAS</w:t>
-      </w:r>
-    </w:p>
-    <w:p>
-      <w:pPr>
-        <w:spacing w:after="60" w:before="0"/>
-      </w:pPr>
-      <w:r>
-        <w:rPr>
-          <w:b w:val="0"/>
-          <w:i w:val="0"/>
-          <w:sz w:val="19"/>
-        </w:rPr>
-        <w:t>1. Cox, B. Fragmentos de sus intervenciones divulgativas sobre nuestro lugar en la Vía Láctea, la entropía y la complejidad, y la frontera del conocimiento (vídeos de referencia aportados). Citas en traducción adaptada al castellano.</w:t>
-      </w:r>
-    </w:p>
-    <w:p>
-      <w:pPr>
-        <w:spacing w:after="60" w:before="0"/>
-      </w:pPr>
-      <w:r>
-        <w:rPr>
-          <w:b w:val="0"/>
-          <w:i w:val="0"/>
-          <w:sz w:val="19"/>
-        </w:rPr>
-        <w:t>2. Cox, B. y Cohen, A. Wonders of the Universe. BBC / HarperCollins, 2011.</w:t>
-      </w:r>
-    </w:p>
-    <w:p>
-      <w:pPr>
-        <w:spacing w:after="60" w:before="0"/>
-      </w:pPr>
-      <w:r>
-        <w:rPr>
-          <w:b w:val="0"/>
-          <w:i w:val="0"/>
-          <w:sz w:val="19"/>
-        </w:rPr>
-        <w:t>3. Sagan, C. Cosmos. Random House, 1980 (ed. esp. Planeta).</w:t>
-      </w:r>
-    </w:p>
-    <w:p>
-      <w:pPr>
-        <w:spacing w:after="60" w:before="0"/>
-      </w:pPr>
-      <w:r>
-        <w:rPr>
-          <w:b w:val="0"/>
-          <w:i w:val="0"/>
-          <w:sz w:val="19"/>
-        </w:rPr>
-        <w:t>4. Sagan, C. Un punto azul pálido. Una visión del futuro humano en el espacio. 1994 (ed. esp. Planeta).</w:t>
-      </w:r>
-    </w:p>
-    <w:p>
-      <w:pPr>
-        <w:spacing w:after="60" w:before="0"/>
-      </w:pPr>
-      <w:r>
-        <w:rPr>
-          <w:b w:val="0"/>
-          <w:i w:val="0"/>
-          <w:sz w:val="19"/>
-        </w:rPr>
-        <w:t>5. Sagan, C. Contact. Simon &amp; Schuster, 1985.</w:t>
-      </w:r>
-    </w:p>
-    <w:p>
-      <w:pPr>
-        <w:spacing w:after="60" w:before="0"/>
-      </w:pPr>
-      <w:r>
-        <w:rPr>
-          <w:b w:val="0"/>
-          <w:i w:val="0"/>
-          <w:sz w:val="19"/>
-        </w:rPr>
-        <w:t>6. Sagan, C. El mundo y sus demonios. La ciencia como una luz en la oscuridad. 1995 (ed. esp. Planeta).</w:t>
-      </w:r>
-    </w:p>
-    <w:p>
-      <w:pPr>
-        <w:spacing w:after="60" w:before="0"/>
-      </w:pPr>
-      <w:r>
-        <w:rPr>
-          <w:b w:val="0"/>
-          <w:i w:val="0"/>
-          <w:sz w:val="19"/>
-        </w:rPr>
-        <w:t>7. Payne, C. Stellar Atmospheres. Tesis doctoral, Radcliffe College / Harvard, 1925; y Cecilia Payne-Gaposchkin: An Autobiography and Other Recollections. Cambridge University Press, 1984.</w:t>
-      </w:r>
-    </w:p>
-    <w:p>
-      <w:pPr>
-        <w:spacing w:after="60" w:before="0"/>
-      </w:pPr>
-      <w:r>
-        <w:rPr>
-          <w:b w:val="0"/>
-          <w:i w:val="0"/>
-          <w:sz w:val="19"/>
-        </w:rPr>
-        <w:t>8. Feynman, R. P. Entrevista en Horizon: The Pleasure of Finding Things Out. BBC, 1981.</w:t>
-      </w:r>
-    </w:p>
-    <w:p>
-      <w:pPr>
-        <w:spacing w:after="60" w:before="0"/>
-      </w:pPr>
-      <w:r>
-        <w:rPr>
-          <w:b w:val="0"/>
-          <w:i w:val="0"/>
-          <w:sz w:val="19"/>
-        </w:rPr>
-        <w:t>9. Shaw, G. B. Back to Methuselah. 1921.</w:t>
-      </w:r>
-    </w:p>
-    <w:p>
-      <w:pPr>
-        <w:spacing w:after="60" w:before="0"/>
-      </w:pPr>
-      <w:r>
-        <w:rPr>
-          <w:b w:val="0"/>
-          <w:i w:val="0"/>
-          <w:sz w:val="19"/>
-        </w:rPr>
-        <w:t>10. Rousseau, J.-J. Emilio, o De la educación. 1762.</w:t>
-      </w:r>
-    </w:p>
-    <w:p>
-      <w:pPr>
-        <w:spacing w:after="60" w:before="0"/>
-      </w:pPr>
-      <w:r>
-        <w:rPr>
-          <w:b w:val="0"/>
-          <w:i w:val="0"/>
-          <w:sz w:val="19"/>
-        </w:rPr>
-        <w:t>11. Wagensberg, J. El pensador intruso. El espíritu interdisciplinario en el mapa del conocimiento. Tusquets, 2014.</w:t>
-      </w:r>
-    </w:p>
-    <w:p>
-      <w:pPr>
-        <w:spacing w:after="60" w:before="0"/>
-      </w:pPr>
-      <w:r>
-        <w:rPr>
-          <w:b w:val="0"/>
-          <w:i w:val="0"/>
-          <w:sz w:val="19"/>
-        </w:rPr>
-        <w:t>12. NASA / JPL. Misión Voyager: fotografía del «punto azul pálido» (14 de febrero de 1990) y distancia actual de Voyager 1.</w:t>
-      </w:r>
-    </w:p>
-    <w:p>
-      <w:pPr>
-        <w:spacing w:after="60" w:before="0"/>
-      </w:pPr>
-      <w:r>
-        <w:rPr>
-          <w:b w:val="0"/>
-          <w:i w:val="0"/>
-          <w:sz w:val="19"/>
-        </w:rPr>
-        <w:t>13. Martín Guerrero, D. Ensayos propios sobre ciencia, debate, dogmatismo y crispación, que inspiran las secciones 2, 4 y 5.</w:t>
-      </w:r>
-    </w:p>
-    <w:p>
-      <w:pPr>
-        <w:spacing w:after="120" w:before="160"/>
-      </w:pPr>
-      <w:r>
-        <w:rPr>
-          <w:b w:val="0"/>
-          <w:i/>
-          <w:color w:val="6B7480"/>
-          <w:sz w:val="19"/>
-        </w:rPr>
-        <w:t>Las citas de Brian Cox se han traducido y adaptado al castellano para su lectura en antena. Las de Sagan, Payne, Feynman, Shaw y Rousseau son traducciones de los textos originales. Los datos astronómicos están redondeados para que se entiendan bien al oído.</w:t>
+        <w:t>[SUBE LA MÚSICA · SE FUNDE LENTAMENTE]</w:t>
       </w:r>
     </w:p>
     <w:sectPr>

</xml_diff>

<commit_message>
Cosmosofía I: guion limpio, sin notas técnicas y con citas en el diálogo
Se quitan los tiempos parciales del índice (queda solo la duración
total), las notas de realización y las indicaciones técnicas. Las citas
dejan de ir en cajas y se integran en las intervenciones de L1 y L2.

Co-Authored-By: Claude Opus 5.5 <noreply@anthropic.com>
Claude-Session: https://claude.ai/code/session_01EXqttE8pyXoNGqAEVvoPvV
</commit_message>
<xml_diff>
--- a/COSMOSOFÍA EPISODIO I/COSMOSOFÍA EPISODIO I - Guion (editable).docx
+++ b/COSMOSOFÍA EPISODIO I/COSMOSOFÍA EPISODIO I - Guion (editable).docx
@@ -82,19 +82,6 @@
           <w:sz w:val="21"/>
         </w:rPr>
         <w:t>Abrir la ventana</w:t>
-      </w:r>
-    </w:p>
-    <w:p>
-      <w:pPr>
-        <w:spacing w:after="120" w:before="0"/>
-      </w:pPr>
-      <w:r>
-        <w:rPr>
-          <w:i w:val="0"/>
-          <w:color w:val="6B7480"/>
-          <w:sz w:val="19"/>
-        </w:rPr>
-        <w:t>[CORTINILLA DE LA SECCIÓN]</w:t>
       </w:r>
     </w:p>
     <w:p>
@@ -189,19 +176,6 @@
     </w:p>
     <w:p>
       <w:pPr>
-        <w:spacing w:after="120" w:before="0"/>
-      </w:pPr>
-      <w:r>
-        <w:rPr>
-          <w:i w:val="0"/>
-          <w:color w:val="6B7480"/>
-          <w:sz w:val="19"/>
-        </w:rPr>
-        <w:t>[ENTRA MÚSICA AMBIENTAL, LENTA · SE QUEDA DE FONDO]</w:t>
-      </w:r>
-    </w:p>
-    <w:p>
-      <w:pPr>
         <w:spacing w:after="0" w:before="280"/>
       </w:pPr>
       <w:r>
@@ -277,49 +251,7 @@
         <w:rPr>
           <w:i w:val="0"/>
         </w:rPr>
-        <w:t>El físico británico Brian Cox lo resume así: estamos en un planeta, entre cuatrocientos mil millones de estrellas, entre dos billones de galaxias… y el universo podría ser infinito más allá de nuestro horizonte. Pero luego le da la vuelta a todo.</w:t>
-      </w:r>
-    </w:p>
-    <w:p>
-      <w:pPr>
-        <w:spacing w:after="20" w:before="0"/>
-        <w:ind w:left="680"/>
-      </w:pPr>
-      <w:r>
-        <w:rPr>
-          <w:b/>
-          <w:color w:val="3A64A0"/>
-          <w:sz w:val="19"/>
-        </w:rPr>
-        <w:t>Eco 1.1 (Brian Cox)</w:t>
-      </w:r>
-    </w:p>
-    <w:p>
-      <w:pPr>
-        <w:spacing w:after="20" w:before="0"/>
-        <w:ind w:left="680"/>
-      </w:pPr>
-      <w:r>
-        <w:rPr>
-          <w:i/>
-          <w:color w:val="1B2F4E"/>
-          <w:sz w:val="22"/>
-        </w:rPr>
-        <w:t>«Sin embargo, creo que podríamos ser importantes. Puede que solo haya una civilización en la Vía Láctea. Y por eso, en ese mar de cuatrocientos mil millones de soles, podríamos ser mucho más importantes y valiosos de lo que solemos reconocernos.»</w:t>
-      </w:r>
-    </w:p>
-    <w:p>
-      <w:pPr>
-        <w:spacing w:after="160" w:before="0"/>
-        <w:ind w:left="680"/>
-      </w:pPr>
-      <w:r>
-        <w:rPr>
-          <w:i w:val="0"/>
-          <w:color w:val="6B7480"/>
-          <w:sz w:val="18"/>
-        </w:rPr>
-        <w:t>— Brian Cox · traducción adaptada</w:t>
+        <w:t>El físico británico Brian Cox lo resume así: estamos en un planeta, entre cuatrocientos mil millones de estrellas, entre dos billones de galaxias… y el universo podría ser infinito más allá de nuestro horizonte.</w:t>
       </w:r>
     </w:p>
     <w:p>
@@ -337,7 +269,31 @@
         <w:rPr>
           <w:i w:val="0"/>
         </w:rPr>
-        <w:t>La misma cifra que nos hacía sentir insignificantes es la que nos hace únicos. No hace falta ser grande para ser valioso. Basta con ser raro.</w:t>
+        <w:t xml:space="preserve">Pero luego le da la vuelta a todo. Dice: </w:t>
+      </w:r>
+      <w:r>
+        <w:rPr>
+          <w:i/>
+        </w:rPr>
+        <w:t>«Sin embargo, creo que podríamos ser importantes. Puede que solo haya una civilización en la Vía Láctea»</w:t>
+      </w:r>
+      <w:r>
+        <w:rPr>
+          <w:i w:val="0"/>
+        </w:rPr>
+        <w:t xml:space="preserve">. Y por eso, en ese mar de cuatrocientos mil millones de soles, </w:t>
+      </w:r>
+      <w:r>
+        <w:rPr>
+          <w:i/>
+        </w:rPr>
+        <w:t>«podríamos ser mucho más importantes y valiosos de lo que solemos reconocernos»</w:t>
+      </w:r>
+      <w:r>
+        <w:rPr>
+          <w:i w:val="0"/>
+        </w:rPr>
+        <w:t>.</w:t>
       </w:r>
     </w:p>
     <w:p>
@@ -355,65 +311,55 @@
         <w:rPr>
           <w:i w:val="0"/>
         </w:rPr>
+        <w:t>Qué giro. La misma cifra que nos hacía sentir insignificantes es la que nos hace únicos. No hace falta ser grande para ser valioso. Basta con ser raro.</w:t>
+      </w:r>
+    </w:p>
+    <w:p>
+      <w:pPr>
+        <w:spacing w:after="120" w:before="0"/>
+      </w:pPr>
+      <w:r>
+        <w:rPr>
+          <w:b/>
+          <w:color w:val="3A64A0"/>
+        </w:rPr>
+        <w:t xml:space="preserve">L2: </w:t>
+      </w:r>
+      <w:r>
+        <w:rPr>
+          <w:i w:val="0"/>
+        </w:rPr>
         <w:t>En 1990, Carl Sagan consiguió que la sonda Voyager 1 se girase y fotografiase la Tierra desde unos seis mil millones de kilómetros. Salió un puntito azul pálido, más pequeño que un píxel.</w:t>
       </w:r>
     </w:p>
     <w:p>
       <w:pPr>
-        <w:spacing w:after="20" w:before="0"/>
-        <w:ind w:left="680"/>
+        <w:spacing w:after="120" w:before="0"/>
       </w:pPr>
       <w:r>
         <w:rPr>
           <w:b/>
           <w:color w:val="3A64A0"/>
-          <w:sz w:val="19"/>
         </w:rPr>
-        <w:t>Eco 1.2 (Carl Sagan)</w:t>
+        <w:t xml:space="preserve">L1: </w:t>
       </w:r>
-    </w:p>
-    <w:p>
-      <w:pPr>
-        <w:spacing w:after="20" w:before="0"/>
-        <w:ind w:left="680"/>
-      </w:pPr>
-      <w:r>
-        <w:rPr>
-          <w:i/>
-          <w:color w:val="1B2F4E"/>
-          <w:sz w:val="22"/>
-        </w:rPr>
-        <w:t>«Mirad de nuevo ese punto. Eso es aquí. Eso es nuestro hogar. Eso somos nosotros. En él, todos los que amáis, todos los que conocéis, cada ser humano que ha existido, vivió su vida.»</w:t>
-      </w:r>
-    </w:p>
-    <w:p>
-      <w:pPr>
-        <w:spacing w:after="160" w:before="0"/>
-        <w:ind w:left="680"/>
-      </w:pPr>
       <w:r>
         <w:rPr>
           <w:i w:val="0"/>
-          <w:color w:val="6B7480"/>
-          <w:sz w:val="18"/>
         </w:rPr>
-        <w:t xml:space="preserve">— Carl Sagan, </w:t>
+        <w:t xml:space="preserve">Y Sagan escribió sobre esa foto unas palabras que todavía emocionan: </w:t>
       </w:r>
       <w:r>
         <w:rPr>
           <w:i/>
-          <w:color w:val="6B7480"/>
-          <w:sz w:val="18"/>
         </w:rPr>
-        <w:t>Un punto azul pálido</w:t>
+        <w:t>«Mirad de nuevo ese punto. Eso es aquí. Eso es nuestro hogar. Eso somos nosotros. En él, todos los que amáis, todos los que conocéis, cada ser humano que ha existido, vivió su vida»</w:t>
       </w:r>
       <w:r>
         <w:rPr>
           <w:i w:val="0"/>
-          <w:color w:val="6B7480"/>
-          <w:sz w:val="18"/>
         </w:rPr>
-        <w:t xml:space="preserve"> (1994)</w:t>
+        <w:t>.</w:t>
       </w:r>
     </w:p>
     <w:p>
@@ -529,64 +475,19 @@
         <w:rPr>
           <w:i w:val="0"/>
         </w:rPr>
-        <w:t>Ella misma escribió una frase que deberíamos tener todos pegada en la mesa.</w:t>
-      </w:r>
-    </w:p>
-    <w:p>
-      <w:pPr>
-        <w:spacing w:after="20" w:before="0"/>
-        <w:ind w:left="680"/>
-      </w:pPr>
-      <w:r>
-        <w:rPr>
-          <w:b/>
-          <w:color w:val="3A64A0"/>
-          <w:sz w:val="19"/>
-        </w:rPr>
-        <w:t>Eco 2.1 (Cecilia Payne)</w:t>
-      </w:r>
-    </w:p>
-    <w:p>
-      <w:pPr>
-        <w:spacing w:after="20" w:before="0"/>
-        <w:ind w:left="680"/>
-      </w:pPr>
-      <w:r>
-        <w:rPr>
-          <w:i/>
-          <w:color w:val="1B2F4E"/>
-          <w:sz w:val="22"/>
-        </w:rPr>
-        <w:t>«La recompensa del joven científico es la emoción de ser la primera persona en la historia del mundo en ver algo o en comprenderlo.»</w:t>
-      </w:r>
-    </w:p>
-    <w:p>
-      <w:pPr>
-        <w:spacing w:after="160" w:before="0"/>
-        <w:ind w:left="680"/>
-      </w:pPr>
-      <w:r>
-        <w:rPr>
-          <w:i w:val="0"/>
-          <w:color w:val="6B7480"/>
-          <w:sz w:val="18"/>
-        </w:rPr>
-        <w:t xml:space="preserve">— Cecilia Payne-Gaposchkin, </w:t>
+        <w:t xml:space="preserve">Y ella misma lo contaba con una ilusión preciosa. Decía que la recompensa de un joven científico es </w:t>
       </w:r>
       <w:r>
         <w:rPr>
           <w:i/>
-          <w:color w:val="6B7480"/>
-          <w:sz w:val="18"/>
         </w:rPr>
-        <w:t>autobiografía</w:t>
+        <w:t>«la emoción de ser la primera persona en la historia del mundo en ver algo o en comprenderlo»</w:t>
       </w:r>
       <w:r>
         <w:rPr>
           <w:i w:val="0"/>
-          <w:color w:val="6B7480"/>
-          <w:sz w:val="18"/>
         </w:rPr>
+        <w:t>.</w:t>
       </w:r>
     </w:p>
     <w:p>
@@ -609,64 +510,6 @@
     </w:p>
     <w:p>
       <w:pPr>
-        <w:spacing w:after="20" w:before="0"/>
-        <w:ind w:left="680"/>
-      </w:pPr>
-      <w:r>
-        <w:rPr>
-          <w:b/>
-          <w:color w:val="3A64A0"/>
-          <w:sz w:val="19"/>
-        </w:rPr>
-        <w:t>Eco 2.2 (Carl Sagan)</w:t>
-      </w:r>
-    </w:p>
-    <w:p>
-      <w:pPr>
-        <w:spacing w:after="20" w:before="0"/>
-        <w:ind w:left="680"/>
-      </w:pPr>
-      <w:r>
-        <w:rPr>
-          <w:i/>
-          <w:color w:val="1B2F4E"/>
-          <w:sz w:val="22"/>
-        </w:rPr>
-        <w:t>«Somos una manera que tiene el cosmos de conocerse a sí mismo.»</w:t>
-      </w:r>
-    </w:p>
-    <w:p>
-      <w:pPr>
-        <w:spacing w:after="160" w:before="0"/>
-        <w:ind w:left="680"/>
-      </w:pPr>
-      <w:r>
-        <w:rPr>
-          <w:i w:val="0"/>
-          <w:color w:val="6B7480"/>
-          <w:sz w:val="18"/>
-        </w:rPr>
-        <w:t xml:space="preserve">— Carl Sagan, </w:t>
-      </w:r>
-      <w:r>
-        <w:rPr>
-          <w:i/>
-          <w:color w:val="6B7480"/>
-          <w:sz w:val="18"/>
-        </w:rPr>
-        <w:t>Cosmos</w:t>
-      </w:r>
-      <w:r>
-        <w:rPr>
-          <w:i w:val="0"/>
-          <w:color w:val="6B7480"/>
-          <w:sz w:val="18"/>
-        </w:rPr>
-        <w:t xml:space="preserve"> (1980)</w:t>
-      </w:r>
-    </w:p>
-    <w:p>
-      <w:pPr>
         <w:spacing w:after="120" w:before="0"/>
       </w:pPr>
       <w:r>
@@ -680,7 +523,37 @@
         <w:rPr>
           <w:i w:val="0"/>
         </w:rPr>
-        <w:t>Átomos forjados en estrellas que se han organizado hasta formar un cerebro capaz de preguntarse de dónde vienen. Cox lo dice así: somos el cosmos hecho consciente.</w:t>
+        <w:t xml:space="preserve">Sagan lo dijo en una sola frase: </w:t>
+      </w:r>
+      <w:r>
+        <w:rPr>
+          <w:i/>
+        </w:rPr>
+        <w:t>«somos una manera que tiene el cosmos de conocerse a sí mismo»</w:t>
+      </w:r>
+      <w:r>
+        <w:rPr>
+          <w:i w:val="0"/>
+        </w:rPr>
+        <w:t>. Átomos forjados en estrellas que se han organizado hasta formar un cerebro capaz de preguntarse de dónde vienen.</w:t>
+      </w:r>
+    </w:p>
+    <w:p>
+      <w:pPr>
+        <w:spacing w:after="120" w:before="0"/>
+      </w:pPr>
+      <w:r>
+        <w:rPr>
+          <w:b/>
+          <w:color w:val="3A64A0"/>
+        </w:rPr>
+        <w:t xml:space="preserve">L1: </w:t>
+      </w:r>
+      <w:r>
+        <w:rPr>
+          <w:i w:val="0"/>
+        </w:rPr>
+        <w:t>Y Brian Cox lo dice a su manera: somos el cosmos hecho consciente.</w:t>
       </w:r>
     </w:p>
     <w:p>
@@ -742,49 +615,7 @@
         <w:rPr>
           <w:i w:val="0"/>
         </w:rPr>
-        <w:t>Es la flecha del tiempo: la razón por la que recordamos el pasado y no el futuro, y por la que un vaso roto nunca se recompone solo. Pero escuchad cómo lo ve Cox.</w:t>
-      </w:r>
-    </w:p>
-    <w:p>
-      <w:pPr>
-        <w:spacing w:after="20" w:before="0"/>
-        <w:ind w:left="680"/>
-      </w:pPr>
-      <w:r>
-        <w:rPr>
-          <w:b/>
-          <w:color w:val="3A64A0"/>
-          <w:sz w:val="19"/>
-        </w:rPr>
-        <w:t>Eco 3.1 (Brian Cox)</w:t>
-      </w:r>
-    </w:p>
-    <w:p>
-      <w:pPr>
-        <w:spacing w:after="20" w:before="0"/>
-        <w:ind w:left="680"/>
-      </w:pPr>
-      <w:r>
-        <w:rPr>
-          <w:i/>
-          <w:color w:val="1B2F4E"/>
-          <w:sz w:val="22"/>
-        </w:rPr>
-        <w:t>«El universo tiende hacia un estado cada vez más desordenado. Y en ese proceso de ir del orden al desorden, la complejidad surge de forma natural durante un breve instante. Las estrellas, los planetas, la vida… existen porque el universo se está deshaciendo.»</w:t>
-      </w:r>
-    </w:p>
-    <w:p>
-      <w:pPr>
-        <w:spacing w:after="160" w:before="0"/>
-        <w:ind w:left="680"/>
-      </w:pPr>
-      <w:r>
-        <w:rPr>
-          <w:i w:val="0"/>
-          <w:color w:val="6B7480"/>
-          <w:sz w:val="18"/>
-        </w:rPr>
-        <w:t>— Brian Cox · traducción adaptada</w:t>
+        <w:t>Es la flecha del tiempo: la razón por la que recordamos el pasado y no el futuro, y por la que un vaso roto nunca se recompone solo.</w:t>
       </w:r>
     </w:p>
     <w:p>
@@ -802,7 +633,49 @@
         <w:rPr>
           <w:i w:val="0"/>
         </w:rPr>
-        <w:t xml:space="preserve">No existimos </w:t>
+        <w:t xml:space="preserve">Pero Cox lo mira desde otro lado. Explica que, mientras el universo va del orden al desorden, </w:t>
+      </w:r>
+      <w:r>
+        <w:rPr>
+          <w:i/>
+        </w:rPr>
+        <w:t>«la complejidad surge de forma natural durante un breve instante»</w:t>
+      </w:r>
+      <w:r>
+        <w:rPr>
+          <w:i w:val="0"/>
+        </w:rPr>
+        <w:t xml:space="preserve">. Las estrellas, los planetas, la vida… </w:t>
+      </w:r>
+      <w:r>
+        <w:rPr>
+          <w:i/>
+        </w:rPr>
+        <w:t>«existen porque el universo se está deshaciendo»</w:t>
+      </w:r>
+      <w:r>
+        <w:rPr>
+          <w:i w:val="0"/>
+        </w:rPr>
+        <w:t>.</w:t>
+      </w:r>
+    </w:p>
+    <w:p>
+      <w:pPr>
+        <w:spacing w:after="120" w:before="0"/>
+      </w:pPr>
+      <w:r>
+        <w:rPr>
+          <w:b/>
+          <w:color w:val="3A64A0"/>
+        </w:rPr>
+        <w:t xml:space="preserve">L1: </w:t>
+      </w:r>
+      <w:r>
+        <w:rPr>
+          <w:i w:val="0"/>
+        </w:rPr>
+        <w:t xml:space="preserve">O sea, que no existimos </w:t>
       </w:r>
       <w:r>
         <w:rPr>
@@ -838,13 +711,31 @@
           <w:b/>
           <w:color w:val="3A64A0"/>
         </w:rPr>
+        <w:t xml:space="preserve">L2: </w:t>
+      </w:r>
+      <w:r>
+        <w:rPr>
+          <w:i w:val="0"/>
+        </w:rPr>
+        <w:t>Y por eso todo lo complejo es necesariamente finito. Lo que nunca se acaba no hace falta cuidarlo; lo raro y lo breve es lo que de verdad vale.</w:t>
+      </w:r>
+    </w:p>
+    <w:p>
+      <w:pPr>
+        <w:spacing w:after="120" w:before="0"/>
+      </w:pPr>
+      <w:r>
+        <w:rPr>
+          <w:b/>
+          <w:color w:val="3A64A0"/>
+        </w:rPr>
         <w:t xml:space="preserve">L1: </w:t>
       </w:r>
       <w:r>
         <w:rPr>
           <w:i w:val="0"/>
         </w:rPr>
-        <w:t>Por eso todo lo complejo es necesariamente finito. Lo que nunca se acaba no hace falta cuidarlo; lo raro y lo breve es lo que de verdad vale.</w:t>
+        <w:t>Sagan lo explicaba con su Calendario Cósmico. Si comprimimos la historia del universo en un año, el Sol no aparece hasta finales de agosto, los dinosaurios llegan en Navidad y los primeros humanos, en los últimos minutos del 31 de diciembre. Toda nuestra historia escrita cabe en los últimos diez segundos de Nochevieja.</w:t>
       </w:r>
     </w:p>
     <w:p>
@@ -862,65 +753,31 @@
         <w:rPr>
           <w:i w:val="0"/>
         </w:rPr>
-        <w:t>Sagan lo explicaba con su Calendario Cósmico. Si comprimimos la historia del universo en un año, el Sol no aparece hasta finales de agosto, los dinosaurios llegan en Navidad y los primeros humanos, en los últimos minutos del 31 de diciembre. Toda nuestra historia escrita cabe en los últimos diez segundos de Nochevieja. Y en esos diez segundos hemos medido la edad del cosmos y hemos pisado la Luna.</w:t>
-      </w:r>
-    </w:p>
-    <w:p>
-      <w:pPr>
-        <w:spacing w:after="20" w:before="0"/>
-        <w:ind w:left="680"/>
-      </w:pPr>
-      <w:r>
-        <w:rPr>
-          <w:b/>
-          <w:color w:val="3A64A0"/>
-          <w:sz w:val="19"/>
-        </w:rPr>
-        <w:t>Eco 3.2 (Carl Sagan)</w:t>
-      </w:r>
-    </w:p>
-    <w:p>
-      <w:pPr>
-        <w:spacing w:after="20" w:before="0"/>
-        <w:ind w:left="680"/>
-      </w:pPr>
-      <w:r>
-        <w:rPr>
-          <w:i/>
-          <w:color w:val="1B2F4E"/>
-          <w:sz w:val="22"/>
-        </w:rPr>
-        <w:t>«Para criaturas tan pequeñas como nosotros, la inmensidad solo es soportable a través del amor.»</w:t>
-      </w:r>
-    </w:p>
-    <w:p>
-      <w:pPr>
-        <w:spacing w:after="160" w:before="0"/>
-        <w:ind w:left="680"/>
-      </w:pPr>
-      <w:r>
-        <w:rPr>
-          <w:i w:val="0"/>
-          <w:color w:val="6B7480"/>
-          <w:sz w:val="18"/>
-        </w:rPr>
-        <w:t xml:space="preserve">— Carl Sagan, </w:t>
+        <w:t xml:space="preserve">Y en esos diez segundos hemos medido la edad del cosmos y hemos pisado la Luna. Ante tanta inmensidad, me quedo con lo que escribió Sagan en </w:t>
       </w:r>
       <w:r>
         <w:rPr>
           <w:i/>
-          <w:color w:val="6B7480"/>
-          <w:sz w:val="18"/>
         </w:rPr>
         <w:t>Contact</w:t>
       </w:r>
       <w:r>
         <w:rPr>
           <w:i w:val="0"/>
-          <w:color w:val="6B7480"/>
-          <w:sz w:val="18"/>
         </w:rPr>
-        <w:t xml:space="preserve"> (1985)</w:t>
+        <w:t xml:space="preserve">: </w:t>
+      </w:r>
+      <w:r>
+        <w:rPr>
+          <w:i/>
+        </w:rPr>
+        <w:t>«para criaturas tan pequeñas como nosotros, la inmensidad solo es soportable a través del amor»</w:t>
+      </w:r>
+      <w:r>
+        <w:rPr>
+          <w:i w:val="0"/>
+        </w:rPr>
+        <w:t>.</w:t>
       </w:r>
     </w:p>
     <w:p>
@@ -964,7 +821,19 @@
         <w:rPr>
           <w:i w:val="0"/>
         </w:rPr>
-        <w:t xml:space="preserve">George Bernard Shaw decía: «Ves cosas y dices: ¿por qué? Pero yo sueño cosas que nunca existieron y digo: ¿por qué no?». Y la ciencia vive ahí, en el </w:t>
+        <w:t xml:space="preserve">George Bernard Shaw decía: </w:t>
+      </w:r>
+      <w:r>
+        <w:rPr>
+          <w:i/>
+        </w:rPr>
+        <w:t>«Ves cosas y dices: ¿por qué? Pero yo sueño cosas que nunca existieron y digo: ¿por qué no?»</w:t>
+      </w:r>
+      <w:r>
+        <w:rPr>
+          <w:i w:val="0"/>
+        </w:rPr>
+        <w:t xml:space="preserve">. Y la ciencia vive ahí, en el </w:t>
       </w:r>
       <w:r>
         <w:rPr>
@@ -998,48 +867,6 @@
     </w:p>
     <w:p>
       <w:pPr>
-        <w:spacing w:after="20" w:before="0"/>
-        <w:ind w:left="680"/>
-      </w:pPr>
-      <w:r>
-        <w:rPr>
-          <w:b/>
-          <w:color w:val="3A64A0"/>
-          <w:sz w:val="19"/>
-        </w:rPr>
-        <w:t>Eco 4.1 (Brian Cox)</w:t>
-      </w:r>
-    </w:p>
-    <w:p>
-      <w:pPr>
-        <w:spacing w:after="20" w:before="0"/>
-        <w:ind w:left="680"/>
-      </w:pPr>
-      <w:r>
-        <w:rPr>
-          <w:i/>
-          <w:color w:val="1B2F4E"/>
-          <w:sz w:val="22"/>
-        </w:rPr>
-        <w:t>«Para un científico, el lugar más bello en el que se puede estar es la frontera entre lo conocido y lo desconocido. Y queda tanto, tanto por explorar.»</w:t>
-      </w:r>
-    </w:p>
-    <w:p>
-      <w:pPr>
-        <w:spacing w:after="160" w:before="0"/>
-        <w:ind w:left="680"/>
-      </w:pPr>
-      <w:r>
-        <w:rPr>
-          <w:i w:val="0"/>
-          <w:color w:val="6B7480"/>
-          <w:sz w:val="18"/>
-        </w:rPr>
-        <w:t>— Brian Cox · traducción adaptada</w:t>
-      </w:r>
-    </w:p>
-    <w:p>
-      <w:pPr>
         <w:spacing w:after="120" w:before="0"/>
       </w:pPr>
       <w:r>
@@ -1053,49 +880,19 @@
         <w:rPr>
           <w:i w:val="0"/>
         </w:rPr>
-        <w:t>No dice que lo más bello sea tener todas las respuestas, sino estar en el borde. En la duda. Richard Feynman pensaba igual.</w:t>
+        <w:t xml:space="preserve">Brian Cox dice que, para un científico, </w:t>
       </w:r>
-    </w:p>
-    <w:p>
-      <w:pPr>
-        <w:spacing w:after="20" w:before="0"/>
-        <w:ind w:left="680"/>
-      </w:pPr>
-      <w:r>
-        <w:rPr>
-          <w:b/>
-          <w:color w:val="3A64A0"/>
-          <w:sz w:val="19"/>
-        </w:rPr>
-        <w:t>Eco 4.2 (Richard Feynman)</w:t>
-      </w:r>
-    </w:p>
-    <w:p>
-      <w:pPr>
-        <w:spacing w:after="20" w:before="0"/>
-        <w:ind w:left="680"/>
-      </w:pPr>
       <w:r>
         <w:rPr>
           <w:i/>
-          <w:color w:val="1B2F4E"/>
-          <w:sz w:val="22"/>
         </w:rPr>
-        <w:t>«Puedo vivir con la duda, con la incertidumbre y con no saber. Creo que es mucho más interesante vivir sin saber que tener respuestas que podrían estar equivocadas.»</w:t>
+        <w:t>«el lugar más bello en el que se puede estar es la frontera entre lo conocido y lo desconocido»</w:t>
       </w:r>
-    </w:p>
-    <w:p>
-      <w:pPr>
-        <w:spacing w:after="160" w:before="0"/>
-        <w:ind w:left="680"/>
-      </w:pPr>
       <w:r>
         <w:rPr>
           <w:i w:val="0"/>
-          <w:color w:val="6B7480"/>
-          <w:sz w:val="18"/>
         </w:rPr>
-        <w:t>— Richard Feynman, entrevista en la BBC (1981)</w:t>
+        <w:t>. Y que queda tanto, tanto por explorar.</w:t>
       </w:r>
     </w:p>
     <w:p>
@@ -1108,6 +905,36 @@
           <w:color w:val="3A64A0"/>
         </w:rPr>
         <w:t xml:space="preserve">L2: </w:t>
+      </w:r>
+      <w:r>
+        <w:rPr>
+          <w:i w:val="0"/>
+        </w:rPr>
+        <w:t xml:space="preserve">Fíjate que no dice que lo más bello sea tener todas las respuestas, sino estar en el borde. En la duda. Feynman pensaba igual: </w:t>
+      </w:r>
+      <w:r>
+        <w:rPr>
+          <w:i/>
+        </w:rPr>
+        <w:t>«Puedo vivir con la duda y con no saber. Creo que es mucho más interesante vivir sin saber que tener respuestas que podrían estar equivocadas»</w:t>
+      </w:r>
+      <w:r>
+        <w:rPr>
+          <w:i w:val="0"/>
+        </w:rPr>
+        <w:t>.</w:t>
+      </w:r>
+    </w:p>
+    <w:p>
+      <w:pPr>
+        <w:spacing w:after="120" w:before="0"/>
+      </w:pPr>
+      <w:r>
+        <w:rPr>
+          <w:b/>
+          <w:color w:val="3A64A0"/>
+        </w:rPr>
+        <w:t xml:space="preserve">L1: </w:t>
       </w:r>
       <w:r>
         <w:rPr>
@@ -1149,13 +976,25 @@
           <w:b/>
           <w:color w:val="3A64A0"/>
         </w:rPr>
-        <w:t xml:space="preserve">L1: </w:t>
+        <w:t xml:space="preserve">L2: </w:t>
       </w:r>
       <w:r>
         <w:rPr>
           <w:i w:val="0"/>
         </w:rPr>
-        <w:t>Rousseau lo resumía muy bien: «Prefiero ser un hombre de paradojas que un hombre de prejuicios». La ciencia se equivoca, y no pasa nada: corregirse es su mayor virtud. Nadie es dueño de la verdad.</w:t>
+        <w:t xml:space="preserve">Rousseau lo resumía muy bien: </w:t>
+      </w:r>
+      <w:r>
+        <w:rPr>
+          <w:i/>
+        </w:rPr>
+        <w:t>«Prefiero ser un hombre de paradojas que un hombre de prejuicios»</w:t>
+      </w:r>
+      <w:r>
+        <w:rPr>
+          <w:i w:val="0"/>
+        </w:rPr>
+        <w:t>. La ciencia se equivoca, y no pasa nada: corregirse es su mayor virtud. Nadie es dueño de la verdad.</w:t>
       </w:r>
     </w:p>
     <w:p>
@@ -1167,7 +1006,7 @@
           <w:b/>
           <w:color w:val="3A64A0"/>
         </w:rPr>
-        <w:t xml:space="preserve">L2: </w:t>
+        <w:t xml:space="preserve">L1: </w:t>
       </w:r>
       <w:r>
         <w:rPr>
@@ -1222,60 +1061,50 @@
     </w:p>
     <w:p>
       <w:pPr>
-        <w:spacing w:after="20" w:before="0"/>
-        <w:ind w:left="680"/>
+        <w:spacing w:after="120" w:before="0"/>
       </w:pPr>
       <w:r>
         <w:rPr>
           <w:b/>
           <w:color w:val="3A64A0"/>
-          <w:sz w:val="19"/>
         </w:rPr>
-        <w:t>Eco 5.1 (Carl Sagan)</w:t>
+        <w:t xml:space="preserve">L1: </w:t>
+      </w:r>
+      <w:r>
+        <w:rPr>
+          <w:i w:val="0"/>
+        </w:rPr>
+        <w:t xml:space="preserve">Sagan decía que esa foto </w:t>
+      </w:r>
+      <w:r>
+        <w:rPr>
+          <w:i/>
+        </w:rPr>
+        <w:t>«subraya nuestra responsabilidad de tratarnos mejor los unos a los otros, y de preservar y querer ese punto azul pálido, el único hogar que hemos conocido»</w:t>
+      </w:r>
+      <w:r>
+        <w:rPr>
+          <w:i w:val="0"/>
+        </w:rPr>
+        <w:t>.</w:t>
       </w:r>
     </w:p>
     <w:p>
       <w:pPr>
-        <w:spacing w:after="20" w:before="0"/>
-        <w:ind w:left="680"/>
+        <w:spacing w:after="120" w:before="0"/>
       </w:pPr>
       <w:r>
         <w:rPr>
-          <w:i/>
-          <w:color w:val="1B2F4E"/>
-          <w:sz w:val="22"/>
+          <w:b/>
+          <w:color w:val="3A64A0"/>
         </w:rPr>
-        <w:t>«Para mí, esto subraya nuestra responsabilidad de tratarnos mejor los unos a los otros, y de preservar y querer ese punto azul pálido, el único hogar que hemos conocido.»</w:t>
-      </w:r>
-    </w:p>
-    <w:p>
-      <w:pPr>
-        <w:spacing w:after="160" w:before="0"/>
-        <w:ind w:left="680"/>
-      </w:pPr>
-      <w:r>
-        <w:rPr>
-          <w:i w:val="0"/>
-          <w:color w:val="6B7480"/>
-          <w:sz w:val="18"/>
-        </w:rPr>
-        <w:t xml:space="preserve">— Carl Sagan, </w:t>
-      </w:r>
-      <w:r>
-        <w:rPr>
-          <w:i/>
-          <w:color w:val="6B7480"/>
-          <w:sz w:val="18"/>
-        </w:rPr>
-        <w:t>Un punto azul pálido</w:t>
+        <w:t xml:space="preserve">L2: </w:t>
       </w:r>
       <w:r>
         <w:rPr>
           <w:i w:val="0"/>
-          <w:color w:val="6B7480"/>
-          <w:sz w:val="18"/>
         </w:rPr>
-        <w:t xml:space="preserve"> (1994)</w:t>
+        <w:t>Muchos astronautas cuentan algo parecido. Lo llaman el «efecto perspectiva»: ven la Tierra desde fuera, sin fronteras dibujadas, con una atmósfera tan fina como una piel… y vuelven sintiendo que lo que nos separa es pequeñísimo al lado de lo que compartimos.</w:t>
       </w:r>
     </w:p>
     <w:p>
@@ -1293,7 +1122,7 @@
         <w:rPr>
           <w:i w:val="0"/>
         </w:rPr>
-        <w:t>Muchos astronautas cuentan algo parecido. Lo llaman el «efecto perspectiva»: ven la Tierra desde fuera, sin fronteras dibujadas, con una atmósfera tan fina como una piel… y vuelven sintiendo que lo que nos separa es pequeñísimo al lado de lo que compartimos.</w:t>
+        <w:t>Y si quizá somos la única civilización de la galaxia, no podemos permitirnos el desprecio. Somos demasiado escasos y valiosos para malgastarnos odiándonos.</w:t>
       </w:r>
     </w:p>
     <w:p>
@@ -1306,24 +1135,6 @@
           <w:color w:val="3A64A0"/>
         </w:rPr>
         <w:t xml:space="preserve">L2: </w:t>
-      </w:r>
-      <w:r>
-        <w:rPr>
-          <w:i w:val="0"/>
-        </w:rPr>
-        <w:t>Y si quizá somos la única civilización de la galaxia, no podemos permitirnos el desprecio. Somos demasiado escasos y valiosos para malgastarnos odiándonos.</w:t>
-      </w:r>
-    </w:p>
-    <w:p>
-      <w:pPr>
-        <w:spacing w:after="120" w:before="0"/>
-      </w:pPr>
-      <w:r>
-        <w:rPr>
-          <w:b/>
-          <w:color w:val="3A64A0"/>
-        </w:rPr>
-        <w:t xml:space="preserve">L1: </w:t>
       </w:r>
       <w:r>
         <w:rPr>
@@ -1550,19 +1361,6 @@
           <w:i w:val="0"/>
         </w:rPr>
         <w:t>!</w:t>
-      </w:r>
-    </w:p>
-    <w:p>
-      <w:pPr>
-        <w:spacing w:after="120" w:before="0"/>
-      </w:pPr>
-      <w:r>
-        <w:rPr>
-          <w:i w:val="0"/>
-          <w:color w:val="6B7480"/>
-          <w:sz w:val="19"/>
-        </w:rPr>
-        <w:t>[SUBE LA MÚSICA · SE FUNDE LENTAMENTE]</w:t>
       </w:r>
     </w:p>
     <w:sectPr>

</xml_diff>

<commit_message>
Cosmosofía I: guiño cómico a la asociación Supernova
Co-Authored-By: Claude Opus 5.5 <noreply@anthropic.com>
Claude-Session: https://claude.ai/code/session_01EXqttE8pyXoNGqAEVvoPvV
</commit_message>
<xml_diff>
--- a/COSMOSOFÍA EPISODIO I/COSMOSOFÍA EPISODIO I - Guion (editable).docx
+++ b/COSMOSOFÍA EPISODIO I/COSMOSOFÍA EPISODIO I - Guion (editable).docx
@@ -457,7 +457,43 @@
         <w:rPr>
           <w:i w:val="0"/>
         </w:rPr>
-        <w:t>Que las estrellas están hechas sobre todo de hidrógeno y helio lo descubrió en 1925 una joven astrónoma, Cecilia Payne. La convencieron de presentarlo como algo que, casi con seguridad, no podía ser real… y pocos años después le dieron la razón.</w:t>
+        <w:t>Y nunca mejor dicho, porque sin Supernova tampoco estaríamos aquí, delante de este micrófono.</w:t>
+      </w:r>
+    </w:p>
+    <w:p>
+      <w:pPr>
+        <w:spacing w:after="120" w:before="0"/>
+      </w:pPr>
+      <w:r>
+        <w:rPr>
+          <w:b/>
+          <w:color w:val="3A64A0"/>
+        </w:rPr>
+        <w:t xml:space="preserve">L2: </w:t>
+      </w:r>
+      <w:r>
+        <w:rPr>
+          <w:i w:val="0"/>
+        </w:rPr>
+        <w:t>Pues eso: gracias, Supernova, por el hierro de nuestra sangre… y por invitarnos a la radio.</w:t>
+      </w:r>
+    </w:p>
+    <w:p>
+      <w:pPr>
+        <w:spacing w:after="120" w:before="0"/>
+      </w:pPr>
+      <w:r>
+        <w:rPr>
+          <w:b/>
+          <w:color w:val="3A64A0"/>
+        </w:rPr>
+        <w:t xml:space="preserve">L1: </w:t>
+      </w:r>
+      <w:r>
+        <w:rPr>
+          <w:i w:val="0"/>
+        </w:rPr>
+        <w:t>Bromas aparte, ¿sabéis quién descubrió de qué están hechas las estrellas? Una joven astrónoma, Cecilia Payne, en 1925: sobre todo de hidrógeno y helio. La convencieron de presentarlo como algo que, casi con seguridad, no podía ser real… y pocos años después le dieron la razón.</w:t>
       </w:r>
     </w:p>
     <w:p>

</xml_diff>

<commit_message>
Cosmosofía I: secciones 3-5 con voz propia, menos citas
Las secciones 3 a 5 se reescriben a partir de los ensayos del autor
(dogmatismo en la ciencia y crispación), quitando la mayoría de citas y
nombres propios. Se ajustan fuentes, resumen y alternancia de voces.

Co-Authored-By: Claude Opus 5.5 <noreply@anthropic.com>
Claude-Session: https://claude.ai/code/session_01EXqttE8pyXoNGqAEVvoPvV
</commit_message>
<xml_diff>
--- a/COSMOSOFÍA EPISODIO I/COSMOSOFÍA EPISODIO I - Guion (editable).docx
+++ b/COSMOSOFÍA EPISODIO I/COSMOSOFÍA EPISODIO I - Guion (editable).docx
@@ -633,7 +633,7 @@
         <w:rPr>
           <w:i w:val="0"/>
         </w:rPr>
-        <w:t>Vamos con una idea que parece triste: la segunda ley de la termodinámica. El desorden del universo siempre aumenta. El café se enfría, las estrellas se apagan.</w:t>
+        <w:t>Vamos con una idea que parece triste: la segunda ley de la termodinámica. El desorden del universo siempre aumenta. El café se enfría, los castillos de arena se deshacen y, algún día, las estrellas se apagarán.</w:t>
       </w:r>
     </w:p>
     <w:p>
@@ -669,31 +669,7 @@
         <w:rPr>
           <w:i w:val="0"/>
         </w:rPr>
-        <w:t xml:space="preserve">Pero Cox lo mira desde otro lado. Explica que, mientras el universo va del orden al desorden, </w:t>
-      </w:r>
-      <w:r>
-        <w:rPr>
-          <w:i/>
-        </w:rPr>
-        <w:t>«la complejidad surge de forma natural durante un breve instante»</w:t>
-      </w:r>
-      <w:r>
-        <w:rPr>
-          <w:i w:val="0"/>
-        </w:rPr>
-        <w:t xml:space="preserve">. Las estrellas, los planetas, la vida… </w:t>
-      </w:r>
-      <w:r>
-        <w:rPr>
-          <w:i/>
-        </w:rPr>
-        <w:t>«existen porque el universo se está deshaciendo»</w:t>
-      </w:r>
-      <w:r>
-        <w:rPr>
-          <w:i w:val="0"/>
-        </w:rPr>
-        <w:t>.</w:t>
+        <w:t>Pero esa misma ley esconde algo precioso. Mientras el universo va del orden al desorden, por el camino aparecen, durante un instante, cosas complejas y bellísimas: estrellas, planetas… y vida.</w:t>
       </w:r>
     </w:p>
     <w:p>
@@ -753,7 +729,7 @@
         <w:rPr>
           <w:i w:val="0"/>
         </w:rPr>
-        <w:t>Y por eso todo lo complejo es necesariamente finito. Lo que nunca se acaba no hace falta cuidarlo; lo raro y lo breve es lo que de verdad vale.</w:t>
+        <w:t>Y eso significa que todo lo complejo es finito. Nosotros también. Y aquí es donde, al menos a mí, la física me reconcilia con la vida: lo que nunca se acaba no hace falta cuidarlo. Lo raro y lo breve es lo que de verdad vale.</w:t>
       </w:r>
     </w:p>
     <w:p>
@@ -771,7 +747,7 @@
         <w:rPr>
           <w:i w:val="0"/>
         </w:rPr>
-        <w:t>Sagan lo explicaba con su Calendario Cósmico. Si comprimimos la historia del universo en un año, el Sol no aparece hasta finales de agosto, los dinosaurios llegan en Navidad y los primeros humanos, en los últimos minutos del 31 de diciembre. Toda nuestra historia escrita cabe en los últimos diez segundos de Nochevieja.</w:t>
+        <w:t>Si comprimiéramos toda la historia del universo en un solo año, toda nuestra historia escrita cabría en los últimos diez segundos de Nochevieja.</w:t>
       </w:r>
     </w:p>
     <w:p>
@@ -789,31 +765,25 @@
         <w:rPr>
           <w:i w:val="0"/>
         </w:rPr>
-        <w:t xml:space="preserve">Y en esos diez segundos hemos medido la edad del cosmos y hemos pisado la Luna. Ante tanta inmensidad, me quedo con lo que escribió Sagan en </w:t>
+        <w:t>Diez segundos. Y en ese suspiro hemos medido la edad del cosmos, hemos pisado la Luna y hemos aprendido a escuchar cómo chocan dos agujeros negros.</w:t>
       </w:r>
+    </w:p>
+    <w:p>
+      <w:pPr>
+        <w:spacing w:after="120" w:before="0"/>
+      </w:pPr>
       <w:r>
         <w:rPr>
-          <w:i/>
+          <w:b/>
+          <w:color w:val="3A64A0"/>
         </w:rPr>
-        <w:t>Contact</w:t>
+        <w:t xml:space="preserve">L1: </w:t>
       </w:r>
       <w:r>
         <w:rPr>
           <w:i w:val="0"/>
         </w:rPr>
-        <w:t xml:space="preserve">: </w:t>
-      </w:r>
-      <w:r>
-        <w:rPr>
-          <w:i/>
-        </w:rPr>
-        <w:t>«para criaturas tan pequeñas como nosotros, la inmensidad solo es soportable a través del amor»</w:t>
-      </w:r>
-      <w:r>
-        <w:rPr>
-          <w:i w:val="0"/>
-        </w:rPr>
-        <w:t>.</w:t>
+        <w:t>Así que la pregunta no es cuánto tiempo tenemos, sino qué hacemos con él. Y creo que la respuesta es sencilla: aprender, crear… y querernos un poco más.</w:t>
       </w:r>
     </w:p>
     <w:p>
@@ -851,25 +821,13 @@
           <w:b/>
           <w:color w:val="3A64A0"/>
         </w:rPr>
-        <w:t xml:space="preserve">L1: </w:t>
+        <w:t xml:space="preserve">L2: </w:t>
       </w:r>
       <w:r>
         <w:rPr>
           <w:i w:val="0"/>
         </w:rPr>
-        <w:t xml:space="preserve">George Bernard Shaw decía: </w:t>
-      </w:r>
-      <w:r>
-        <w:rPr>
-          <w:i/>
-        </w:rPr>
-        <w:t>«Ves cosas y dices: ¿por qué? Pero yo sueño cosas que nunca existieron y digo: ¿por qué no?»</w:t>
-      </w:r>
-      <w:r>
-        <w:rPr>
-          <w:i w:val="0"/>
-        </w:rPr>
-        <w:t xml:space="preserve">. Y la ciencia vive ahí, en el </w:t>
+        <w:t xml:space="preserve">Solemos decir que la ciencia trata del porqué. Pero yo creo que trata, sobre todo, del </w:t>
       </w:r>
       <w:r>
         <w:rPr>
@@ -892,13 +850,31 @@
           <w:b/>
           <w:color w:val="3A64A0"/>
         </w:rPr>
+        <w:t xml:space="preserve">L1: </w:t>
+      </w:r>
+      <w:r>
+        <w:rPr>
+          <w:i w:val="0"/>
+        </w:rPr>
+        <w:t>¿Por qué no van a estar hechas las estrellas de algo distinto de lo que todos creen? ¿Por qué no van a moverse los continentes? ¿Por qué no va a curvarse el espacio?</w:t>
+      </w:r>
+    </w:p>
+    <w:p>
+      <w:pPr>
+        <w:spacing w:after="120" w:before="0"/>
+      </w:pPr>
+      <w:r>
+        <w:rPr>
+          <w:b/>
+          <w:color w:val="3A64A0"/>
+        </w:rPr>
         <w:t xml:space="preserve">L2: </w:t>
       </w:r>
       <w:r>
         <w:rPr>
           <w:i w:val="0"/>
         </w:rPr>
-        <w:t>¿Por qué no van a estar hechas las estrellas de algo distinto de lo que todos creen? ¿Por qué no va a curvarse el espacio, como se atrevió a imaginar Einstein?</w:t>
+        <w:t>Todas esas ideas sonaron absurdas en su momento. Algunas, incluso, fueron ridiculizadas. Y hoy están en cualquier libro de texto.</w:t>
       </w:r>
     </w:p>
     <w:p>
@@ -916,19 +892,7 @@
         <w:rPr>
           <w:i w:val="0"/>
         </w:rPr>
-        <w:t xml:space="preserve">Brian Cox dice que, para un científico, </w:t>
-      </w:r>
-      <w:r>
-        <w:rPr>
-          <w:i/>
-        </w:rPr>
-        <w:t>«el lugar más bello en el que se puede estar es la frontera entre lo conocido y lo desconocido»</w:t>
-      </w:r>
-      <w:r>
-        <w:rPr>
-          <w:i w:val="0"/>
-        </w:rPr>
-        <w:t>. Y que queda tanto, tanto por explorar.</w:t>
+        <w:t>Porque la ciencia, en el fondo, es más una actitud que un conjunto de respuestas: observar, preguntar, escuchar y estar dispuesto a cambiar de opinión. Las universidades nacieron así, leyendo y discutiendo. Rebatiendo con argumentos, no con burlas.</w:t>
       </w:r>
     </w:p>
     <w:p>
@@ -946,19 +910,7 @@
         <w:rPr>
           <w:i w:val="0"/>
         </w:rPr>
-        <w:t xml:space="preserve">Fíjate que no dice que lo más bello sea tener todas las respuestas, sino estar en el borde. En la duda. Feynman pensaba igual: </w:t>
-      </w:r>
-      <w:r>
-        <w:rPr>
-          <w:i/>
-        </w:rPr>
-        <w:t>«Puedo vivir con la duda y con no saber. Creo que es mucho más interesante vivir sin saber que tener respuestas que podrían estar equivocadas»</w:t>
-      </w:r>
-      <w:r>
-        <w:rPr>
-          <w:i w:val="0"/>
-        </w:rPr>
-        <w:t>.</w:t>
+        <w:t>Y eso a veces se nos olvida. Hay quien presenta la ciencia como una verdad absoluta, desde arriba, riéndose del que duda. Y lo único que consigue es alejar a la gente.</w:t>
       </w:r>
     </w:p>
     <w:p>
@@ -976,31 +928,7 @@
         <w:rPr>
           <w:i w:val="0"/>
         </w:rPr>
-        <w:t xml:space="preserve">Las universidades nacieron así, con la </w:t>
-      </w:r>
-      <w:r>
-        <w:rPr>
-          <w:i/>
-        </w:rPr>
-        <w:t>lectio</w:t>
-      </w:r>
-      <w:r>
-        <w:rPr>
-          <w:i w:val="0"/>
-        </w:rPr>
-        <w:t xml:space="preserve"> y la </w:t>
-      </w:r>
-      <w:r>
-        <w:rPr>
-          <w:i/>
-        </w:rPr>
-        <w:t>disputatio</w:t>
-      </w:r>
-      <w:r>
-        <w:rPr>
-          <w:i w:val="0"/>
-        </w:rPr>
-        <w:t>: leer y después discutir con argumentos, no con burlas.</w:t>
+        <w:t>Además, la ciencia se equivoca. Y no pasa nada: corregirse es precisamente su mayor virtud. Las paradojas, las contradicciones, lo que no encaja… ahí es donde suele nacer lo nuevo.</w:t>
       </w:r>
     </w:p>
     <w:p>
@@ -1018,19 +946,7 @@
         <w:rPr>
           <w:i w:val="0"/>
         </w:rPr>
-        <w:t xml:space="preserve">Rousseau lo resumía muy bien: </w:t>
-      </w:r>
-      <w:r>
-        <w:rPr>
-          <w:i/>
-        </w:rPr>
-        <w:t>«Prefiero ser un hombre de paradojas que un hombre de prejuicios»</w:t>
-      </w:r>
-      <w:r>
-        <w:rPr>
-          <w:i w:val="0"/>
-        </w:rPr>
-        <w:t>. La ciencia se equivoca, y no pasa nada: corregirse es su mayor virtud. Nadie es dueño de la verdad.</w:t>
+        <w:t>Nadie es dueño de la verdad. La verdad es un horizonte, como el de las estrellas: nunca llegamos del todo, pero caminar hacia él nos hace mejores.</w:t>
       </w:r>
     </w:p>
     <w:p>
@@ -1048,7 +964,7 @@
         <w:rPr>
           <w:i w:val="0"/>
         </w:rPr>
-        <w:t>Por eso esto se llama Cosmosofía. Aquí caben la física, la filosofía y las preguntas que aún no tienen respuesta. Como escribió Sagan, la ciencia es una profunda fuente de espiritualidad.</w:t>
+        <w:t>Por eso esta sección se llama Cosmosofía. Porque al cielo se le puede mirar con un telescopio, pero también con la filosofía, con el arte o con la intuición. Y cuantas más miradas, más lejos vemos.</w:t>
       </w:r>
     </w:p>
     <w:p>
@@ -1092,7 +1008,7 @@
         <w:rPr>
           <w:i w:val="0"/>
         </w:rPr>
-        <w:t>Vivimos un tiempo de bandos y de ruido, de ganar discusiones en vez de entendernos. Y desde aquel píxel de la Voyager, todo eso se ve de otra manera.</w:t>
+        <w:t>Y esto nos lleva a algo que vivimos cada día. Estamos en un momento de crispación: bandos, etiquetas, la cultura del «zasca». Ganar la discusión en un mensaje de diez segundos en vez de intentar entender al otro.</w:t>
       </w:r>
     </w:p>
     <w:p>
@@ -1110,19 +1026,7 @@
         <w:rPr>
           <w:i w:val="0"/>
         </w:rPr>
-        <w:t xml:space="preserve">Sagan decía que esa foto </w:t>
-      </w:r>
-      <w:r>
-        <w:rPr>
-          <w:i/>
-        </w:rPr>
-        <w:t>«subraya nuestra responsabilidad de tratarnos mejor los unos a los otros, y de preservar y querer ese punto azul pálido, el único hogar que hemos conocido»</w:t>
-      </w:r>
-      <w:r>
-        <w:rPr>
-          <w:i w:val="0"/>
-        </w:rPr>
-        <w:t>.</w:t>
+        <w:t>Ya casi no escuchamos: prejuzgamos. Cada uno en su trinchera, sin salir de ella. Cuando escuchar al que piensa diferente es de los ejercicios más enriquecedores que existen.</w:t>
       </w:r>
     </w:p>
     <w:p>
@@ -1140,7 +1044,7 @@
         <w:rPr>
           <w:i w:val="0"/>
         </w:rPr>
-        <w:t>Muchos astronautas cuentan algo parecido. Lo llaman el «efecto perspectiva»: ven la Tierra desde fuera, sin fronteras dibujadas, con una atmósfera tan fina como una piel… y vuelven sintiendo que lo que nos separa es pequeñísimo al lado de lo que compartimos.</w:t>
+        <w:t>Pues volvamos a aquella foto de la Voyager. Desde allí no se ven fronteras, ni partidos, ni bandos. Solo un puntito azul suspendido en la oscuridad. Todo lo que alguna vez nos ha enfrentado cabe en un píxel.</w:t>
       </w:r>
     </w:p>
     <w:p>
@@ -1158,7 +1062,7 @@
         <w:rPr>
           <w:i w:val="0"/>
         </w:rPr>
-        <w:t>Y si quizá somos la única civilización de la galaxia, no podemos permitirnos el desprecio. Somos demasiado escasos y valiosos para malgastarnos odiándonos.</w:t>
+        <w:t>Los astronautas que han visto la Tierra desde fuera suelen contar lo mismo: vuelven sintiendo que lo que nos separa es pequeñísimo al lado de lo que compartimos.</w:t>
       </w:r>
     </w:p>
     <w:p>
@@ -1176,7 +1080,61 @@
         <w:rPr>
           <w:i w:val="0"/>
         </w:rPr>
-        <w:t>Escuchar al que piensa distinto no es darle la razón. Es reconocer que compartimos el mismo punto azul.</w:t>
+        <w:t>Y si de verdad somos tan raros en el universo, quizá la única civilización de la galaxia, no podemos permitirnos el desprecio. Somos demasiado escasos y valiosos para malgastarnos odiándonos.</w:t>
+      </w:r>
+    </w:p>
+    <w:p>
+      <w:pPr>
+        <w:spacing w:after="120" w:before="0"/>
+      </w:pPr>
+      <w:r>
+        <w:rPr>
+          <w:b/>
+          <w:color w:val="3A64A0"/>
+        </w:rPr>
+        <w:t xml:space="preserve">L1: </w:t>
+      </w:r>
+      <w:r>
+        <w:rPr>
+          <w:i w:val="0"/>
+        </w:rPr>
+        <w:t>Escuchar no significa darle la razón al otro. Significa reconocer que los dos estamos sobre el mismo punto azul, haciéndonos las mismas preguntas desde lugares diferentes.</w:t>
+      </w:r>
+    </w:p>
+    <w:p>
+      <w:pPr>
+        <w:spacing w:after="120" w:before="0"/>
+      </w:pPr>
+      <w:r>
+        <w:rPr>
+          <w:b/>
+          <w:color w:val="3A64A0"/>
+        </w:rPr>
+        <w:t xml:space="preserve">L2: </w:t>
+      </w:r>
+      <w:r>
+        <w:rPr>
+          <w:i w:val="0"/>
+        </w:rPr>
+        <w:t>Hay un viejo proverbio que dice que, cuando el sabio señala la Luna, el necio mira el dedo. Pues eso: dejemos de pelearnos por el dedo… y miremos la Luna. Juntos.</w:t>
+      </w:r>
+    </w:p>
+    <w:p>
+      <w:pPr>
+        <w:spacing w:after="120" w:before="0"/>
+      </w:pPr>
+      <w:r>
+        <w:rPr>
+          <w:b/>
+          <w:color w:val="3A64A0"/>
+        </w:rPr>
+        <w:t xml:space="preserve">L1: </w:t>
+      </w:r>
+      <w:r>
+        <w:rPr>
+          <w:i w:val="0"/>
+        </w:rPr>
+        <w:t>Tender puentes, no callar bocas.</w:t>
       </w:r>
     </w:p>
     <w:p>
@@ -1214,7 +1172,7 @@
           <w:b/>
           <w:color w:val="3A64A0"/>
         </w:rPr>
-        <w:t xml:space="preserve">L1: </w:t>
+        <w:t xml:space="preserve">L2: </w:t>
       </w:r>
       <w:r>
         <w:rPr>
@@ -1232,7 +1190,7 @@
           <w:b/>
           <w:color w:val="3A64A0"/>
         </w:rPr>
-        <w:t xml:space="preserve">L2: </w:t>
+        <w:t xml:space="preserve">L1: </w:t>
       </w:r>
       <w:r>
         <w:rPr>
@@ -1250,7 +1208,7 @@
           <w:b/>
           <w:color w:val="3A64A0"/>
         </w:rPr>
-        <w:t xml:space="preserve">L1: </w:t>
+        <w:t xml:space="preserve">L2: </w:t>
       </w:r>
       <w:r>
         <w:rPr>
@@ -1268,7 +1226,7 @@
           <w:b/>
           <w:color w:val="3A64A0"/>
         </w:rPr>
-        <w:t xml:space="preserve">L2: </w:t>
+        <w:t xml:space="preserve">L1: </w:t>
       </w:r>
       <w:r>
         <w:rPr>
@@ -1312,7 +1270,7 @@
           <w:b/>
           <w:color w:val="3A64A0"/>
         </w:rPr>
-        <w:t xml:space="preserve">L1: </w:t>
+        <w:t xml:space="preserve">L2: </w:t>
       </w:r>
       <w:r>
         <w:rPr>
@@ -1330,7 +1288,7 @@
           <w:b/>
           <w:color w:val="3A64A0"/>
         </w:rPr>
-        <w:t xml:space="preserve">L2: </w:t>
+        <w:t xml:space="preserve">L1: </w:t>
       </w:r>
       <w:r>
         <w:rPr>
@@ -1360,7 +1318,7 @@
           <w:b/>
           <w:color w:val="3A64A0"/>
         </w:rPr>
-        <w:t xml:space="preserve">L1: </w:t>
+        <w:t xml:space="preserve">L2: </w:t>
       </w:r>
       <w:r>
         <w:rPr>

</xml_diff>

<commit_message>
Cosmosofía I: quitar sección de la flecha del tiempo y fuentes
Se elimina la sección 3 para acortar el guion (unos 8 minutos) y la
página de fuentes y citas. Se renumeran las secciones y el índice.

Co-Authored-By: Claude Opus 5.5 <noreply@anthropic.com>
Claude-Session: https://claude.ai/code/session_01EXqttE8pyXoNGqAEVvoPvV
</commit_message>
<xml_diff>
--- a/COSMOSOFÍA EPISODIO I/COSMOSOFÍA EPISODIO I - Guion (editable).docx
+++ b/COSMOSOFÍA EPISODIO I/COSMOSOFÍA EPISODIO I - Guion (editable).docx
@@ -602,201 +602,7 @@
           <w:color w:val="1B2F4E"/>
           <w:sz w:val="26"/>
         </w:rPr>
-        <w:t>3. LA FLECHA DEL TIEMPO</w:t>
-      </w:r>
-    </w:p>
-    <w:p>
-      <w:pPr>
-        <w:spacing w:after="160" w:before="0"/>
-      </w:pPr>
-      <w:r>
-        <w:rPr>
-          <w:i/>
-          <w:color w:val="6B7480"/>
-          <w:sz w:val="21"/>
-        </w:rPr>
-        <w:t>Por qué lo efímero es lo valioso</w:t>
-      </w:r>
-    </w:p>
-    <w:p>
-      <w:pPr>
-        <w:spacing w:after="120" w:before="0"/>
-      </w:pPr>
-      <w:r>
-        <w:rPr>
-          <w:b/>
-          <w:color w:val="3A64A0"/>
-        </w:rPr>
-        <w:t xml:space="preserve">L2: </w:t>
-      </w:r>
-      <w:r>
-        <w:rPr>
-          <w:i w:val="0"/>
-        </w:rPr>
-        <w:t>Vamos con una idea que parece triste: la segunda ley de la termodinámica. El desorden del universo siempre aumenta. El café se enfría, los castillos de arena se deshacen y, algún día, las estrellas se apagarán.</w:t>
-      </w:r>
-    </w:p>
-    <w:p>
-      <w:pPr>
-        <w:spacing w:after="120" w:before="0"/>
-      </w:pPr>
-      <w:r>
-        <w:rPr>
-          <w:b/>
-          <w:color w:val="3A64A0"/>
-        </w:rPr>
-        <w:t xml:space="preserve">L1: </w:t>
-      </w:r>
-      <w:r>
-        <w:rPr>
-          <w:i w:val="0"/>
-        </w:rPr>
-        <w:t>Es la flecha del tiempo: la razón por la que recordamos el pasado y no el futuro, y por la que un vaso roto nunca se recompone solo.</w:t>
-      </w:r>
-    </w:p>
-    <w:p>
-      <w:pPr>
-        <w:spacing w:after="120" w:before="0"/>
-      </w:pPr>
-      <w:r>
-        <w:rPr>
-          <w:b/>
-          <w:color w:val="3A64A0"/>
-        </w:rPr>
-        <w:t xml:space="preserve">L2: </w:t>
-      </w:r>
-      <w:r>
-        <w:rPr>
-          <w:i w:val="0"/>
-        </w:rPr>
-        <w:t>Pero esa misma ley esconde algo precioso. Mientras el universo va del orden al desorden, por el camino aparecen, durante un instante, cosas complejas y bellísimas: estrellas, planetas… y vida.</w:t>
-      </w:r>
-    </w:p>
-    <w:p>
-      <w:pPr>
-        <w:spacing w:after="120" w:before="0"/>
-      </w:pPr>
-      <w:r>
-        <w:rPr>
-          <w:b/>
-          <w:color w:val="3A64A0"/>
-        </w:rPr>
-        <w:t xml:space="preserve">L1: </w:t>
-      </w:r>
-      <w:r>
-        <w:rPr>
-          <w:i w:val="0"/>
-        </w:rPr>
-        <w:t xml:space="preserve">O sea, que no existimos </w:t>
-      </w:r>
-      <w:r>
-        <w:rPr>
-          <w:i/>
-        </w:rPr>
-        <w:t>a pesar de</w:t>
-      </w:r>
-      <w:r>
-        <w:rPr>
-          <w:i w:val="0"/>
-        </w:rPr>
-        <w:t xml:space="preserve"> que el universo se desordena, sino </w:t>
-      </w:r>
-      <w:r>
-        <w:rPr>
-          <w:i/>
-        </w:rPr>
-        <w:t>porque</w:t>
-      </w:r>
-      <w:r>
-        <w:rPr>
-          <w:i w:val="0"/>
-        </w:rPr>
-        <w:t xml:space="preserve"> se desordena. Como los remolinos de un río, que solo existen porque el agua fluye.</w:t>
-      </w:r>
-    </w:p>
-    <w:p>
-      <w:pPr>
-        <w:spacing w:after="120" w:before="0"/>
-      </w:pPr>
-      <w:r>
-        <w:rPr>
-          <w:b/>
-          <w:color w:val="3A64A0"/>
-        </w:rPr>
-        <w:t xml:space="preserve">L2: </w:t>
-      </w:r>
-      <w:r>
-        <w:rPr>
-          <w:i w:val="0"/>
-        </w:rPr>
-        <w:t>Y eso significa que todo lo complejo es finito. Nosotros también. Y aquí es donde, al menos a mí, la física me reconcilia con la vida: lo que nunca se acaba no hace falta cuidarlo. Lo raro y lo breve es lo que de verdad vale.</w:t>
-      </w:r>
-    </w:p>
-    <w:p>
-      <w:pPr>
-        <w:spacing w:after="120" w:before="0"/>
-      </w:pPr>
-      <w:r>
-        <w:rPr>
-          <w:b/>
-          <w:color w:val="3A64A0"/>
-        </w:rPr>
-        <w:t xml:space="preserve">L1: </w:t>
-      </w:r>
-      <w:r>
-        <w:rPr>
-          <w:i w:val="0"/>
-        </w:rPr>
-        <w:t>Si comprimiéramos toda la historia del universo en un solo año, toda nuestra historia escrita cabría en los últimos diez segundos de Nochevieja.</w:t>
-      </w:r>
-    </w:p>
-    <w:p>
-      <w:pPr>
-        <w:spacing w:after="120" w:before="0"/>
-      </w:pPr>
-      <w:r>
-        <w:rPr>
-          <w:b/>
-          <w:color w:val="3A64A0"/>
-        </w:rPr>
-        <w:t xml:space="preserve">L2: </w:t>
-      </w:r>
-      <w:r>
-        <w:rPr>
-          <w:i w:val="0"/>
-        </w:rPr>
-        <w:t>Diez segundos. Y en ese suspiro hemos medido la edad del cosmos, hemos pisado la Luna y hemos aprendido a escuchar cómo chocan dos agujeros negros.</w:t>
-      </w:r>
-    </w:p>
-    <w:p>
-      <w:pPr>
-        <w:spacing w:after="120" w:before="0"/>
-      </w:pPr>
-      <w:r>
-        <w:rPr>
-          <w:b/>
-          <w:color w:val="3A64A0"/>
-        </w:rPr>
-        <w:t xml:space="preserve">L1: </w:t>
-      </w:r>
-      <w:r>
-        <w:rPr>
-          <w:i w:val="0"/>
-        </w:rPr>
-        <w:t>Así que la pregunta no es cuánto tiempo tenemos, sino qué hacemos con él. Y creo que la respuesta es sencilla: aprender, crear… y querernos un poco más.</w:t>
-      </w:r>
-    </w:p>
-    <w:p>
-      <w:pPr>
-        <w:spacing w:after="0" w:before="280"/>
-      </w:pPr>
-      <w:r>
-        <w:rPr>
-          <w:b/>
-          <w:color w:val="1B2F4E"/>
-          <w:sz w:val="26"/>
-        </w:rPr>
-        <w:t>4. ¿POR QUÉ NO?</w:t>
+        <w:t>3. ¿POR QUÉ NO?</w:t>
       </w:r>
     </w:p>
     <w:p>
@@ -977,7 +783,7 @@
           <w:color w:val="1B2F4E"/>
           <w:sz w:val="26"/>
         </w:rPr>
-        <w:t>5. UN PUNTO AZUL PÁLIDO</w:t>
+        <w:t>4. UN PUNTO AZUL PÁLIDO</w:t>
       </w:r>
     </w:p>
     <w:p>
@@ -1147,7 +953,7 @@
           <w:color w:val="1B2F4E"/>
           <w:sz w:val="26"/>
         </w:rPr>
-        <w:t>6. EPÍLOGO</w:t>
+        <w:t>5. EPÍLOGO</w:t>
       </w:r>
     </w:p>
     <w:p>
@@ -1245,7 +1051,7 @@
           <w:color w:val="1B2F4E"/>
           <w:sz w:val="26"/>
         </w:rPr>
-        <w:t>7. DESPEDIDA</w:t>
+        <w:t>6. DESPEDIDA</w:t>
       </w:r>
     </w:p>
     <w:p>

</xml_diff>

<commit_message>
Cosmosofía I: epílogo más breve y emotivo
Co-Authored-By: Claude Opus 5.5 <noreply@anthropic.com>
Claude-Session: https://claude.ai/code/session_01EXqttE8pyXoNGqAEVvoPvV
</commit_message>
<xml_diff>
--- a/COSMOSOFÍA EPISODIO I/COSMOSOFÍA EPISODIO I - Guion (editable).docx
+++ b/COSMOSOFÍA EPISODIO I/COSMOSOFÍA EPISODIO I - Guion (editable).docx
@@ -984,7 +984,7 @@
         <w:rPr>
           <w:i w:val="0"/>
         </w:rPr>
-        <w:t>Os dejamos una tarea. Esta noche, si está despejado, salid y mirad arriba cinco minutos. Sin móvil.</w:t>
+        <w:t>Esta noche, si está despejado, salid un momento y mirad arriba. Esa luz salió de las estrellas hace años, a veces siglos, y ha cruzado el universo solo para llegar a vuestros ojos. Está hecha de lo mismo que vosotros.</w:t>
       </w:r>
     </w:p>
     <w:p>
@@ -1002,43 +1002,7 @@
         <w:rPr>
           <w:i w:val="0"/>
         </w:rPr>
-        <w:t>Buscad la estrella más brillante y pensad que esa luz salió de allí hace años, a veces siglos: estáis mirando el pasado.</w:t>
-      </w:r>
-    </w:p>
-    <w:p>
-      <w:pPr>
-        <w:spacing w:after="120" w:before="0"/>
-      </w:pPr>
-      <w:r>
-        <w:rPr>
-          <w:b/>
-          <w:color w:val="3A64A0"/>
-        </w:rPr>
-        <w:t xml:space="preserve">L2: </w:t>
-      </w:r>
-      <w:r>
-        <w:rPr>
-          <w:i w:val="0"/>
-        </w:rPr>
-        <w:t>Y si tenéis un cielo oscuro, buscad en la constelación de Andrómeda una manchita difusa: es otra galaxia, y su luz ha viajado dos millones y medio de años hasta vuestros ojos.</w:t>
-      </w:r>
-    </w:p>
-    <w:p>
-      <w:pPr>
-        <w:spacing w:after="120" w:before="0"/>
-      </w:pPr>
-      <w:r>
-        <w:rPr>
-          <w:b/>
-          <w:color w:val="3A64A0"/>
-        </w:rPr>
-        <w:t xml:space="preserve">L1: </w:t>
-      </w:r>
-      <w:r>
-        <w:rPr>
-          <w:i w:val="0"/>
-        </w:rPr>
-        <w:t>Y pensad que estáis hechos de lo mismo que esas estrellas. No sabemos si el cosmos tiene un sentido, pero nosotros podemos dárselo: con lo que aprendemos, con lo que creamos y con cómo nos tratamos.</w:t>
+        <w:t>Quizá el cosmos no tenga un sentido escrito. Pero cada vez que alguien mira al cielo con asombro… se lo da.</w:t>
       </w:r>
     </w:p>
     <w:p>

</xml_diff>

<commit_message>
Cosmosofía I: texto justificado en la versión Word
Co-Authored-By: Claude Opus 5.5 <noreply@anthropic.com>
Claude-Session: https://claude.ai/code/session_01EXqttE8pyXoNGqAEVvoPvV
</commit_message>
<xml_diff>
--- a/COSMOSOFÍA EPISODIO I/COSMOSOFÍA EPISODIO I - Guion (editable).docx
+++ b/COSMOSOFÍA EPISODIO I/COSMOSOFÍA EPISODIO I - Guion (editable).docx
@@ -61,6 +61,7 @@
     <w:p>
       <w:pPr>
         <w:spacing w:after="0" w:before="280"/>
+        <w:jc w:val="both"/>
       </w:pPr>
       <w:r>
         <w:rPr>
@@ -74,6 +75,7 @@
     <w:p>
       <w:pPr>
         <w:spacing w:after="160" w:before="0"/>
+        <w:jc w:val="both"/>
       </w:pPr>
       <w:r>
         <w:rPr>
@@ -87,6 +89,7 @@
     <w:p>
       <w:pPr>
         <w:spacing w:after="120" w:before="0"/>
+        <w:jc w:val="both"/>
       </w:pPr>
       <w:r>
         <w:rPr>
@@ -117,6 +120,7 @@
     <w:p>
       <w:pPr>
         <w:spacing w:after="120" w:before="0"/>
+        <w:jc w:val="both"/>
       </w:pPr>
       <w:r>
         <w:rPr>
@@ -159,6 +163,7 @@
     <w:p>
       <w:pPr>
         <w:spacing w:after="120" w:before="0"/>
+        <w:jc w:val="both"/>
       </w:pPr>
       <w:r>
         <w:rPr>
@@ -177,6 +182,7 @@
     <w:p>
       <w:pPr>
         <w:spacing w:after="0" w:before="280"/>
+        <w:jc w:val="both"/>
       </w:pPr>
       <w:r>
         <w:rPr>
@@ -190,6 +196,7 @@
     <w:p>
       <w:pPr>
         <w:spacing w:after="160" w:before="0"/>
+        <w:jc w:val="both"/>
       </w:pPr>
       <w:r>
         <w:rPr>
@@ -203,6 +210,7 @@
     <w:p>
       <w:pPr>
         <w:spacing w:after="120" w:before="0"/>
+        <w:jc w:val="both"/>
       </w:pPr>
       <w:r>
         <w:rPr>
@@ -221,6 +229,7 @@
     <w:p>
       <w:pPr>
         <w:spacing w:after="120" w:before="0"/>
+        <w:jc w:val="both"/>
       </w:pPr>
       <w:r>
         <w:rPr>
@@ -239,6 +248,7 @@
     <w:p>
       <w:pPr>
         <w:spacing w:after="120" w:before="0"/>
+        <w:jc w:val="both"/>
       </w:pPr>
       <w:r>
         <w:rPr>
@@ -257,6 +267,7 @@
     <w:p>
       <w:pPr>
         <w:spacing w:after="120" w:before="0"/>
+        <w:jc w:val="both"/>
       </w:pPr>
       <w:r>
         <w:rPr>
@@ -299,6 +310,7 @@
     <w:p>
       <w:pPr>
         <w:spacing w:after="120" w:before="0"/>
+        <w:jc w:val="both"/>
       </w:pPr>
       <w:r>
         <w:rPr>
@@ -317,6 +329,7 @@
     <w:p>
       <w:pPr>
         <w:spacing w:after="120" w:before="0"/>
+        <w:jc w:val="both"/>
       </w:pPr>
       <w:r>
         <w:rPr>
@@ -335,6 +348,7 @@
     <w:p>
       <w:pPr>
         <w:spacing w:after="120" w:before="0"/>
+        <w:jc w:val="both"/>
       </w:pPr>
       <w:r>
         <w:rPr>
@@ -365,6 +379,7 @@
     <w:p>
       <w:pPr>
         <w:spacing w:after="120" w:before="0"/>
+        <w:jc w:val="both"/>
       </w:pPr>
       <w:r>
         <w:rPr>
@@ -383,6 +398,7 @@
     <w:p>
       <w:pPr>
         <w:spacing w:after="0" w:before="280"/>
+        <w:jc w:val="both"/>
       </w:pPr>
       <w:r>
         <w:rPr>
@@ -396,6 +412,7 @@
     <w:p>
       <w:pPr>
         <w:spacing w:after="160" w:before="0"/>
+        <w:jc w:val="both"/>
       </w:pPr>
       <w:r>
         <w:rPr>
@@ -409,6 +426,7 @@
     <w:p>
       <w:pPr>
         <w:spacing w:after="120" w:before="0"/>
+        <w:jc w:val="both"/>
       </w:pPr>
       <w:r>
         <w:rPr>
@@ -427,6 +445,7 @@
     <w:p>
       <w:pPr>
         <w:spacing w:after="120" w:before="0"/>
+        <w:jc w:val="both"/>
       </w:pPr>
       <w:r>
         <w:rPr>
@@ -445,6 +464,7 @@
     <w:p>
       <w:pPr>
         <w:spacing w:after="120" w:before="0"/>
+        <w:jc w:val="both"/>
       </w:pPr>
       <w:r>
         <w:rPr>
@@ -463,6 +483,7 @@
     <w:p>
       <w:pPr>
         <w:spacing w:after="120" w:before="0"/>
+        <w:jc w:val="both"/>
       </w:pPr>
       <w:r>
         <w:rPr>
@@ -481,6 +502,7 @@
     <w:p>
       <w:pPr>
         <w:spacing w:after="120" w:before="0"/>
+        <w:jc w:val="both"/>
       </w:pPr>
       <w:r>
         <w:rPr>
@@ -499,6 +521,7 @@
     <w:p>
       <w:pPr>
         <w:spacing w:after="120" w:before="0"/>
+        <w:jc w:val="both"/>
       </w:pPr>
       <w:r>
         <w:rPr>
@@ -529,6 +552,7 @@
     <w:p>
       <w:pPr>
         <w:spacing w:after="120" w:before="0"/>
+        <w:jc w:val="both"/>
       </w:pPr>
       <w:r>
         <w:rPr>
@@ -547,6 +571,7 @@
     <w:p>
       <w:pPr>
         <w:spacing w:after="120" w:before="0"/>
+        <w:jc w:val="both"/>
       </w:pPr>
       <w:r>
         <w:rPr>
@@ -577,6 +602,7 @@
     <w:p>
       <w:pPr>
         <w:spacing w:after="120" w:before="0"/>
+        <w:jc w:val="both"/>
       </w:pPr>
       <w:r>
         <w:rPr>
@@ -595,6 +621,7 @@
     <w:p>
       <w:pPr>
         <w:spacing w:after="0" w:before="280"/>
+        <w:jc w:val="both"/>
       </w:pPr>
       <w:r>
         <w:rPr>
@@ -608,6 +635,7 @@
     <w:p>
       <w:pPr>
         <w:spacing w:after="160" w:before="0"/>
+        <w:jc w:val="both"/>
       </w:pPr>
       <w:r>
         <w:rPr>
@@ -621,6 +649,7 @@
     <w:p>
       <w:pPr>
         <w:spacing w:after="120" w:before="0"/>
+        <w:jc w:val="both"/>
       </w:pPr>
       <w:r>
         <w:rPr>
@@ -650,6 +679,7 @@
     <w:p>
       <w:pPr>
         <w:spacing w:after="120" w:before="0"/>
+        <w:jc w:val="both"/>
       </w:pPr>
       <w:r>
         <w:rPr>
@@ -668,6 +698,7 @@
     <w:p>
       <w:pPr>
         <w:spacing w:after="120" w:before="0"/>
+        <w:jc w:val="both"/>
       </w:pPr>
       <w:r>
         <w:rPr>
@@ -686,6 +717,7 @@
     <w:p>
       <w:pPr>
         <w:spacing w:after="120" w:before="0"/>
+        <w:jc w:val="both"/>
       </w:pPr>
       <w:r>
         <w:rPr>
@@ -704,6 +736,7 @@
     <w:p>
       <w:pPr>
         <w:spacing w:after="120" w:before="0"/>
+        <w:jc w:val="both"/>
       </w:pPr>
       <w:r>
         <w:rPr>
@@ -722,6 +755,7 @@
     <w:p>
       <w:pPr>
         <w:spacing w:after="120" w:before="0"/>
+        <w:jc w:val="both"/>
       </w:pPr>
       <w:r>
         <w:rPr>
@@ -740,6 +774,7 @@
     <w:p>
       <w:pPr>
         <w:spacing w:after="120" w:before="0"/>
+        <w:jc w:val="both"/>
       </w:pPr>
       <w:r>
         <w:rPr>
@@ -758,6 +793,7 @@
     <w:p>
       <w:pPr>
         <w:spacing w:after="120" w:before="0"/>
+        <w:jc w:val="both"/>
       </w:pPr>
       <w:r>
         <w:rPr>
@@ -776,6 +812,7 @@
     <w:p>
       <w:pPr>
         <w:spacing w:after="0" w:before="280"/>
+        <w:jc w:val="both"/>
       </w:pPr>
       <w:r>
         <w:rPr>
@@ -789,6 +826,7 @@
     <w:p>
       <w:pPr>
         <w:spacing w:after="160" w:before="0"/>
+        <w:jc w:val="both"/>
       </w:pPr>
       <w:r>
         <w:rPr>
@@ -802,6 +840,7 @@
     <w:p>
       <w:pPr>
         <w:spacing w:after="120" w:before="0"/>
+        <w:jc w:val="both"/>
       </w:pPr>
       <w:r>
         <w:rPr>
@@ -820,6 +859,7 @@
     <w:p>
       <w:pPr>
         <w:spacing w:after="120" w:before="0"/>
+        <w:jc w:val="both"/>
       </w:pPr>
       <w:r>
         <w:rPr>
@@ -838,6 +878,7 @@
     <w:p>
       <w:pPr>
         <w:spacing w:after="120" w:before="0"/>
+        <w:jc w:val="both"/>
       </w:pPr>
       <w:r>
         <w:rPr>
@@ -856,6 +897,7 @@
     <w:p>
       <w:pPr>
         <w:spacing w:after="120" w:before="0"/>
+        <w:jc w:val="both"/>
       </w:pPr>
       <w:r>
         <w:rPr>
@@ -874,6 +916,7 @@
     <w:p>
       <w:pPr>
         <w:spacing w:after="120" w:before="0"/>
+        <w:jc w:val="both"/>
       </w:pPr>
       <w:r>
         <w:rPr>
@@ -892,6 +935,7 @@
     <w:p>
       <w:pPr>
         <w:spacing w:after="120" w:before="0"/>
+        <w:jc w:val="both"/>
       </w:pPr>
       <w:r>
         <w:rPr>
@@ -910,6 +954,7 @@
     <w:p>
       <w:pPr>
         <w:spacing w:after="120" w:before="0"/>
+        <w:jc w:val="both"/>
       </w:pPr>
       <w:r>
         <w:rPr>
@@ -928,6 +973,7 @@
     <w:p>
       <w:pPr>
         <w:spacing w:after="120" w:before="0"/>
+        <w:jc w:val="both"/>
       </w:pPr>
       <w:r>
         <w:rPr>
@@ -946,6 +992,7 @@
     <w:p>
       <w:pPr>
         <w:spacing w:after="0" w:before="280"/>
+        <w:jc w:val="both"/>
       </w:pPr>
       <w:r>
         <w:rPr>
@@ -959,6 +1006,7 @@
     <w:p>
       <w:pPr>
         <w:spacing w:after="160" w:before="0"/>
+        <w:jc w:val="both"/>
       </w:pPr>
       <w:r>
         <w:rPr>
@@ -972,6 +1020,7 @@
     <w:p>
       <w:pPr>
         <w:spacing w:after="120" w:before="0"/>
+        <w:jc w:val="both"/>
       </w:pPr>
       <w:r>
         <w:rPr>
@@ -990,6 +1039,7 @@
     <w:p>
       <w:pPr>
         <w:spacing w:after="120" w:before="0"/>
+        <w:jc w:val="both"/>
       </w:pPr>
       <w:r>
         <w:rPr>
@@ -1008,6 +1058,7 @@
     <w:p>
       <w:pPr>
         <w:spacing w:after="0" w:before="280"/>
+        <w:jc w:val="both"/>
       </w:pPr>
       <w:r>
         <w:rPr>
@@ -1021,6 +1072,7 @@
     <w:p>
       <w:pPr>
         <w:spacing w:after="160" w:before="0"/>
+        <w:jc w:val="both"/>
       </w:pPr>
       <w:r>
         <w:rPr>
@@ -1034,6 +1086,7 @@
     <w:p>
       <w:pPr>
         <w:spacing w:after="120" w:before="0"/>
+        <w:jc w:val="both"/>
       </w:pPr>
       <w:r>
         <w:rPr>
@@ -1052,6 +1105,7 @@
     <w:p>
       <w:pPr>
         <w:spacing w:after="120" w:before="0"/>
+        <w:jc w:val="both"/>
       </w:pPr>
       <w:r>
         <w:rPr>
@@ -1082,6 +1136,7 @@
     <w:p>
       <w:pPr>
         <w:spacing w:after="120" w:before="0"/>
+        <w:jc w:val="both"/>
       </w:pPr>
       <w:r>
         <w:rPr>
@@ -1100,6 +1155,7 @@
     <w:p>
       <w:pPr>
         <w:spacing w:after="120" w:before="0"/>
+        <w:jc w:val="both"/>
       </w:pPr>
       <w:r>
         <w:rPr>

</xml_diff>